<commit_message>
Lista de actividades v1.1 y actividades añadidas en Project
</commit_message>
<xml_diff>
--- a/Docs/Semana 4/word/Lista_de_actividades_v1.0_2026-10-23.docx
+++ b/Docs/Semana 4/word/Lista_de_actividades_v1.0_2026-10-23.docx
@@ -4,7 +4,7 @@
   <w:body>
     <w:tbl>
       <w:tblPr>
-        <w:tblStyle w:val="TableGrid"/>
+        <w:tblStyle w:val="Tablaconcuadrcula"/>
         <w:tblW w:w="14570" w:type="dxa"/>
         <w:tblBorders>
           <w:top w:val="single" w:sz="4" w:space="0" w:color="BFBFBF"/>
@@ -66,21 +66,12 @@
                 <w:szCs w:val="19"/>
               </w:rPr>
             </w:pPr>
-            <w:proofErr w:type="spellStart"/>
             <w:r>
               <w:rPr>
                 <w:rFonts w:ascii="Arial" w:hAnsi="Arial"/>
                 <w:sz w:val="18"/>
               </w:rPr>
-              <w:t>TuSuper</w:t>
-            </w:r>
-            <w:proofErr w:type="spellEnd"/>
-            <w:r>
-              <w:rPr>
-                <w:rFonts w:ascii="Arial" w:hAnsi="Arial"/>
-                <w:sz w:val="18"/>
-              </w:rPr>
-              <w:t xml:space="preserve"> en línea</w:t>
+              <w:t>TuSuper en línea</w:t>
             </w:r>
           </w:p>
         </w:tc>
@@ -449,7 +440,7 @@
     </w:p>
     <w:tbl>
       <w:tblPr>
-        <w:tblStyle w:val="TableGrid"/>
+        <w:tblStyle w:val="Tablaconcuadrcula"/>
         <w:tblW w:w="14570" w:type="dxa"/>
         <w:tblBorders>
           <w:top w:val="single" w:sz="4" w:space="0" w:color="BFBFBF"/>
@@ -676,6 +667,24 @@
                 <w:szCs w:val="19"/>
               </w:rPr>
             </w:pPr>
+            <w:r>
+              <w:rPr>
+                <w:i/>
+                <w:color w:val="808080"/>
+                <w:sz w:val="19"/>
+                <w:szCs w:val="19"/>
+              </w:rPr>
+              <w:t>v1.</w:t>
+            </w:r>
+            <w:r>
+              <w:rPr>
+                <w:i/>
+                <w:color w:val="808080"/>
+                <w:sz w:val="19"/>
+                <w:szCs w:val="19"/>
+              </w:rPr>
+              <w:t>1</w:t>
+            </w:r>
           </w:p>
         </w:tc>
         <w:tc>
@@ -689,6 +698,15 @@
                 <w:szCs w:val="19"/>
               </w:rPr>
             </w:pPr>
+            <w:r>
+              <w:rPr>
+                <w:i/>
+                <w:color w:val="808080"/>
+                <w:sz w:val="19"/>
+                <w:szCs w:val="19"/>
+              </w:rPr>
+              <w:t>23/10/2026</w:t>
+            </w:r>
           </w:p>
         </w:tc>
         <w:tc>
@@ -702,6 +720,15 @@
                 <w:szCs w:val="19"/>
               </w:rPr>
             </w:pPr>
+            <w:r>
+              <w:rPr>
+                <w:i/>
+                <w:color w:val="808080"/>
+                <w:sz w:val="19"/>
+                <w:szCs w:val="19"/>
+              </w:rPr>
+              <w:t>CVP</w:t>
+            </w:r>
           </w:p>
         </w:tc>
         <w:tc>
@@ -715,6 +742,15 @@
                 <w:szCs w:val="19"/>
               </w:rPr>
             </w:pPr>
+            <w:r>
+              <w:rPr>
+                <w:i/>
+                <w:color w:val="808080"/>
+                <w:sz w:val="19"/>
+                <w:szCs w:val="19"/>
+              </w:rPr>
+              <w:t>Códigos EDT alineados con la EDT v1.4. Añadidas actividades de seguimiento de los Sprints 7 y 8, así como el seguimiento y aceptación de la formación.</w:t>
+            </w:r>
           </w:p>
         </w:tc>
       </w:tr>
@@ -788,7 +824,7 @@
     </w:p>
     <w:tbl>
       <w:tblPr>
-        <w:tblStyle w:val="TableGrid"/>
+        <w:tblStyle w:val="Tablaconcuadrcula"/>
         <w:tblW w:w="14570" w:type="dxa"/>
         <w:tblBorders>
           <w:top w:val="single" w:sz="4" w:space="0" w:color="A7C0C5"/>
@@ -985,25 +1021,7 @@
                 <w:sz w:val="18"/>
                 <w:szCs w:val="18"/>
               </w:rPr>
-              <w:t xml:space="preserve">El nombre del documento ya está puesto y solo hay que cambiar </w:t>
-            </w:r>
-            <w:proofErr w:type="spellStart"/>
-            <w:proofErr w:type="gramStart"/>
-            <w:r>
-              <w:rPr>
-                <w:sz w:val="18"/>
-                <w:szCs w:val="18"/>
-              </w:rPr>
-              <w:t>vX.Y</w:t>
-            </w:r>
-            <w:proofErr w:type="spellEnd"/>
-            <w:proofErr w:type="gramEnd"/>
-            <w:r>
-              <w:rPr>
-                <w:sz w:val="18"/>
-                <w:szCs w:val="18"/>
-              </w:rPr>
-              <w:t xml:space="preserve"> por la versión. La primera que se sube a la carpeta del proyecto es la v1.0, y cada versión con cambios aumenta el segundo número (v1.1, v1.2…), como fija el plan de configuración genérico de la consultora (TC-OP-CFG, apartado 4). La versión que figura en el nombre de esta plantilla es la de la plantilla y no cuenta.</w:t>
+              <w:t>El nombre del documento ya está puesto y solo hay que cambiar vX.Y por la versión. La primera que se sube a la carpeta del proyecto es la v1.0, y cada versión con cambios aumenta el segundo número (v1.1, v1.2…), como fija el plan de configuración genérico de la consultora (TC-OP-CFG, apartado 4). La versión que figura en el nombre de esta plantilla es la de la plantilla y no cuenta.</w:t>
             </w:r>
           </w:p>
         </w:tc>
@@ -1052,39 +1070,7 @@
                 <w:sz w:val="18"/>
                 <w:szCs w:val="18"/>
               </w:rPr>
-              <w:t>El día en que se cierra esta versión (</w:t>
-            </w:r>
-            <w:proofErr w:type="spellStart"/>
-            <w:r>
-              <w:rPr>
-                <w:sz w:val="18"/>
-                <w:szCs w:val="18"/>
-              </w:rPr>
-              <w:t>dd</w:t>
-            </w:r>
-            <w:proofErr w:type="spellEnd"/>
-            <w:r>
-              <w:rPr>
-                <w:sz w:val="18"/>
-                <w:szCs w:val="18"/>
-              </w:rPr>
-              <w:t>/mm/</w:t>
-            </w:r>
-            <w:proofErr w:type="spellStart"/>
-            <w:r>
-              <w:rPr>
-                <w:sz w:val="18"/>
-                <w:szCs w:val="18"/>
-              </w:rPr>
-              <w:t>aaaa</w:t>
-            </w:r>
-            <w:proofErr w:type="spellEnd"/>
-            <w:r>
-              <w:rPr>
-                <w:sz w:val="18"/>
-                <w:szCs w:val="18"/>
-              </w:rPr>
-              <w:t>). Aquí no se usan semanas del proyecto.</w:t>
+              <w:t>El día en que se cierra esta versión (dd/mm/aaaa). Aquí no se usan semanas del proyecto.</w:t>
             </w:r>
           </w:p>
         </w:tc>
@@ -1248,7 +1234,7 @@
     </w:p>
     <w:tbl>
       <w:tblPr>
-        <w:tblStyle w:val="TableGrid"/>
+        <w:tblStyle w:val="Tablaconcuadrcula"/>
         <w:tblW w:w="14570" w:type="dxa"/>
         <w:tblBorders>
           <w:top w:val="single" w:sz="4" w:space="0" w:color="BFBFBF"/>
@@ -1534,9 +1520,8 @@
             <w:r>
               <w:rPr>
                 <w:b/>
-                <w:bCs/>
-                <w:sz w:val="20"/>
-                <w:szCs w:val="20"/>
+                <w:sz w:val="19"/>
+                <w:szCs w:val="19"/>
               </w:rPr>
               <w:t>1.1.1</w:t>
             </w:r>
@@ -1685,9 +1670,8 @@
             <w:r>
               <w:rPr>
                 <w:b/>
-                <w:bCs/>
-                <w:sz w:val="20"/>
-                <w:szCs w:val="20"/>
+                <w:sz w:val="19"/>
+                <w:szCs w:val="19"/>
               </w:rPr>
               <w:t>1.1.2</w:t>
             </w:r>
@@ -1836,9 +1820,8 @@
             <w:r>
               <w:rPr>
                 <w:b/>
-                <w:bCs/>
-                <w:sz w:val="20"/>
-                <w:szCs w:val="20"/>
+                <w:sz w:val="19"/>
+                <w:szCs w:val="19"/>
               </w:rPr>
               <w:t>1.1.3</w:t>
             </w:r>
@@ -1920,7 +1903,6 @@
                 <w:sz w:val="20"/>
                 <w:szCs w:val="20"/>
               </w:rPr>
-              <w:lastRenderedPageBreak/>
               <w:t>ACT-04</w:t>
             </w:r>
           </w:p>
@@ -1988,9 +1970,8 @@
             <w:r>
               <w:rPr>
                 <w:b/>
-                <w:bCs/>
-                <w:sz w:val="20"/>
-                <w:szCs w:val="20"/>
+                <w:sz w:val="19"/>
+                <w:szCs w:val="19"/>
               </w:rPr>
               <w:t>1.1.4</w:t>
             </w:r>
@@ -2139,9 +2120,8 @@
             <w:r>
               <w:rPr>
                 <w:b/>
-                <w:bCs/>
-                <w:sz w:val="20"/>
-                <w:szCs w:val="20"/>
+                <w:sz w:val="19"/>
+                <w:szCs w:val="19"/>
               </w:rPr>
               <w:t>1.1.5</w:t>
             </w:r>
@@ -2290,9 +2270,8 @@
             <w:r>
               <w:rPr>
                 <w:b/>
-                <w:bCs/>
-                <w:sz w:val="20"/>
-                <w:szCs w:val="20"/>
+                <w:sz w:val="19"/>
+                <w:szCs w:val="19"/>
               </w:rPr>
               <w:t>1.1.6</w:t>
             </w:r>
@@ -2441,9 +2420,8 @@
             <w:r>
               <w:rPr>
                 <w:b/>
-                <w:bCs/>
-                <w:sz w:val="20"/>
-                <w:szCs w:val="20"/>
+                <w:sz w:val="19"/>
+                <w:szCs w:val="19"/>
               </w:rPr>
               <w:t>1.1.7</w:t>
             </w:r>
@@ -2513,18 +2491,20 @@
               <w:jc w:val="center"/>
               <w:rPr>
                 <w:b/>
-                <w:sz w:val="19"/>
-                <w:szCs w:val="19"/>
-              </w:rPr>
-            </w:pPr>
-            <w:r>
-              <w:rPr>
-                <w:b/>
                 <w:bCs/>
                 <w:color w:val="1F497D"/>
                 <w:sz w:val="20"/>
                 <w:szCs w:val="20"/>
               </w:rPr>
+            </w:pPr>
+            <w:r>
+              <w:rPr>
+                <w:b/>
+                <w:bCs/>
+                <w:color w:val="1F497D"/>
+                <w:sz w:val="20"/>
+                <w:szCs w:val="20"/>
+              </w:rPr>
               <w:t>ACT-08</w:t>
             </w:r>
           </w:p>
@@ -2538,17 +2518,23 @@
             <w:pPr>
               <w:spacing w:before="120" w:after="120"/>
               <w:rPr>
-                <w:b/>
-                <w:sz w:val="19"/>
-                <w:szCs w:val="19"/>
-              </w:rPr>
-            </w:pPr>
-            <w:r>
-              <w:rPr>
-                <w:sz w:val="20"/>
-                <w:szCs w:val="20"/>
-              </w:rPr>
-              <w:t>Cierre formal y liquidación</w:t>
+                <w:sz w:val="20"/>
+                <w:szCs w:val="20"/>
+              </w:rPr>
+            </w:pPr>
+            <w:r>
+              <w:rPr>
+                <w:sz w:val="20"/>
+                <w:szCs w:val="20"/>
+              </w:rPr>
+              <w:t xml:space="preserve">Dirección y control del Sprint </w:t>
+            </w:r>
+            <w:r>
+              <w:rPr>
+                <w:sz w:val="20"/>
+                <w:szCs w:val="20"/>
+              </w:rPr>
+              <w:t>7</w:t>
             </w:r>
           </w:p>
         </w:tc>
@@ -2561,17 +2547,30 @@
             <w:pPr>
               <w:spacing w:before="120" w:after="120"/>
               <w:rPr>
-                <w:b/>
-                <w:sz w:val="19"/>
-                <w:szCs w:val="19"/>
-              </w:rPr>
-            </w:pPr>
-            <w:r>
-              <w:rPr>
-                <w:sz w:val="20"/>
-                <w:szCs w:val="20"/>
-              </w:rPr>
-              <w:t>Elaboración del informe de cierre, balance de líneas base, registro de lecciones aprendidas y liberación del personal.</w:t>
+                <w:sz w:val="20"/>
+                <w:szCs w:val="20"/>
+              </w:rPr>
+            </w:pPr>
+            <w:r>
+              <w:rPr>
+                <w:sz w:val="20"/>
+                <w:szCs w:val="20"/>
+              </w:rPr>
+              <w:t xml:space="preserve">Gestión de la ejecución del Sprint </w:t>
+            </w:r>
+            <w:r>
+              <w:rPr>
+                <w:sz w:val="20"/>
+                <w:szCs w:val="20"/>
+              </w:rPr>
+              <w:t>7</w:t>
+            </w:r>
+            <w:r>
+              <w:rPr>
+                <w:sz w:val="20"/>
+                <w:szCs w:val="20"/>
+              </w:rPr>
+              <w:t>, seguimiento diario y preparación del paso a producción.</w:t>
             </w:r>
           </w:p>
         </w:tc>
@@ -2585,8 +2584,9 @@
               <w:spacing w:before="120" w:after="120"/>
               <w:rPr>
                 <w:b/>
-                <w:sz w:val="19"/>
-                <w:szCs w:val="19"/>
+                <w:bCs/>
+                <w:sz w:val="20"/>
+                <w:szCs w:val="20"/>
               </w:rPr>
             </w:pPr>
             <w:r>
@@ -2609,9 +2609,8 @@
             <w:pPr>
               <w:spacing w:before="120" w:after="120"/>
               <w:rPr>
-                <w:b/>
-                <w:sz w:val="19"/>
-                <w:szCs w:val="19"/>
+                <w:sz w:val="20"/>
+                <w:szCs w:val="20"/>
               </w:rPr>
             </w:pPr>
             <w:r>
@@ -2633,8 +2632,9 @@
               <w:spacing w:before="120" w:after="120"/>
               <w:rPr>
                 <w:b/>
-                <w:sz w:val="19"/>
-                <w:szCs w:val="19"/>
+                <w:bCs/>
+                <w:sz w:val="20"/>
+                <w:szCs w:val="20"/>
               </w:rPr>
             </w:pPr>
             <w:r>
@@ -2664,18 +2664,20 @@
               <w:jc w:val="center"/>
               <w:rPr>
                 <w:b/>
-                <w:sz w:val="19"/>
-                <w:szCs w:val="19"/>
-              </w:rPr>
-            </w:pPr>
-            <w:r>
-              <w:rPr>
-                <w:b/>
                 <w:bCs/>
                 <w:color w:val="1F497D"/>
                 <w:sz w:val="20"/>
                 <w:szCs w:val="20"/>
               </w:rPr>
+            </w:pPr>
+            <w:r>
+              <w:rPr>
+                <w:b/>
+                <w:bCs/>
+                <w:color w:val="1F497D"/>
+                <w:sz w:val="20"/>
+                <w:szCs w:val="20"/>
+              </w:rPr>
               <w:t>ACT-09</w:t>
             </w:r>
           </w:p>
@@ -2689,17 +2691,23 @@
             <w:pPr>
               <w:spacing w:before="120" w:after="120"/>
               <w:rPr>
-                <w:b/>
-                <w:sz w:val="19"/>
-                <w:szCs w:val="19"/>
-              </w:rPr>
-            </w:pPr>
-            <w:r>
-              <w:rPr>
-                <w:sz w:val="20"/>
-                <w:szCs w:val="20"/>
-              </w:rPr>
-              <w:t>Traspaso al servicio de mantenimiento</w:t>
+                <w:sz w:val="20"/>
+                <w:szCs w:val="20"/>
+              </w:rPr>
+            </w:pPr>
+            <w:r>
+              <w:rPr>
+                <w:sz w:val="20"/>
+                <w:szCs w:val="20"/>
+              </w:rPr>
+              <w:t xml:space="preserve">Dirección y control del Sprint </w:t>
+            </w:r>
+            <w:r>
+              <w:rPr>
+                <w:sz w:val="20"/>
+                <w:szCs w:val="20"/>
+              </w:rPr>
+              <w:t>8</w:t>
             </w:r>
           </w:p>
         </w:tc>
@@ -2712,17 +2720,30 @@
             <w:pPr>
               <w:spacing w:before="120" w:after="120"/>
               <w:rPr>
-                <w:b/>
-                <w:sz w:val="19"/>
-                <w:szCs w:val="19"/>
-              </w:rPr>
-            </w:pPr>
-            <w:r>
-              <w:rPr>
-                <w:sz w:val="20"/>
-                <w:szCs w:val="20"/>
-              </w:rPr>
-              <w:t>Traspaso del repositorio, configuración, relación de defectos abiertos y provisión para la garantía.</w:t>
+                <w:sz w:val="20"/>
+                <w:szCs w:val="20"/>
+              </w:rPr>
+            </w:pPr>
+            <w:r>
+              <w:rPr>
+                <w:sz w:val="20"/>
+                <w:szCs w:val="20"/>
+              </w:rPr>
+              <w:t xml:space="preserve">Gestión de la ejecución del Sprint </w:t>
+            </w:r>
+            <w:r>
+              <w:rPr>
+                <w:sz w:val="20"/>
+                <w:szCs w:val="20"/>
+              </w:rPr>
+              <w:t>8</w:t>
+            </w:r>
+            <w:r>
+              <w:rPr>
+                <w:sz w:val="20"/>
+                <w:szCs w:val="20"/>
+              </w:rPr>
+              <w:t>, seguimiento diario y preparación del paso a producción.</w:t>
             </w:r>
           </w:p>
         </w:tc>
@@ -2736,8 +2757,9 @@
               <w:spacing w:before="120" w:after="120"/>
               <w:rPr>
                 <w:b/>
-                <w:sz w:val="19"/>
-                <w:szCs w:val="19"/>
+                <w:bCs/>
+                <w:sz w:val="20"/>
+                <w:szCs w:val="20"/>
               </w:rPr>
             </w:pPr>
             <w:r>
@@ -2760,9 +2782,8 @@
             <w:pPr>
               <w:spacing w:before="120" w:after="120"/>
               <w:rPr>
-                <w:b/>
-                <w:sz w:val="19"/>
-                <w:szCs w:val="19"/>
+                <w:sz w:val="20"/>
+                <w:szCs w:val="20"/>
               </w:rPr>
             </w:pPr>
             <w:r>
@@ -2784,8 +2805,9 @@
               <w:spacing w:before="120" w:after="120"/>
               <w:rPr>
                 <w:b/>
-                <w:sz w:val="19"/>
-                <w:szCs w:val="19"/>
+                <w:bCs/>
+                <w:sz w:val="20"/>
+                <w:szCs w:val="20"/>
               </w:rPr>
             </w:pPr>
             <w:r>
@@ -2850,7 +2872,7 @@
                 <w:sz w:val="20"/>
                 <w:szCs w:val="20"/>
               </w:rPr>
-              <w:t>Especificación funcional común</w:t>
+              <w:t>Cierre formal y liquidación</w:t>
             </w:r>
           </w:p>
         </w:tc>
@@ -2873,23 +2895,7 @@
                 <w:sz w:val="20"/>
                 <w:szCs w:val="20"/>
               </w:rPr>
-              <w:t xml:space="preserve">Definición de especificaciones funcionales comunes y acuerdos de criterios de aceptación con </w:t>
-            </w:r>
-            <w:proofErr w:type="spellStart"/>
-            <w:r>
-              <w:rPr>
-                <w:sz w:val="20"/>
-                <w:szCs w:val="20"/>
-              </w:rPr>
-              <w:t>TuSuper</w:t>
-            </w:r>
-            <w:proofErr w:type="spellEnd"/>
-            <w:r>
-              <w:rPr>
-                <w:sz w:val="20"/>
-                <w:szCs w:val="20"/>
-              </w:rPr>
-              <w:t>.</w:t>
+              <w:t>Elaboración del informe de cierre, balance de líneas base, registro de lecciones aprendidas y liberación del personal.</w:t>
             </w:r>
           </w:p>
         </w:tc>
@@ -2910,11 +2916,10 @@
             <w:r>
               <w:rPr>
                 <w:b/>
-                <w:bCs/>
-                <w:sz w:val="20"/>
-                <w:szCs w:val="20"/>
-              </w:rPr>
-              <w:t>1.2.1.1</w:t>
+                <w:sz w:val="19"/>
+                <w:szCs w:val="19"/>
+              </w:rPr>
+              <w:t>1.1.11</w:t>
             </w:r>
           </w:p>
         </w:tc>
@@ -2934,13 +2939,10 @@
             </w:pPr>
             <w:r>
               <w:rPr>
-                <w:b/>
-                <w:bCs/>
-                <w:color w:val="548235"/>
-                <w:sz w:val="20"/>
-                <w:szCs w:val="20"/>
-              </w:rPr>
-              <w:t>EP-01</w:t>
+                <w:sz w:val="20"/>
+                <w:szCs w:val="20"/>
+              </w:rPr>
+              <w:t>—</w:t>
             </w:r>
           </w:p>
         </w:tc>
@@ -3020,7 +3022,7 @@
                 <w:sz w:val="20"/>
                 <w:szCs w:val="20"/>
               </w:rPr>
-              <w:t>Diseño del sistema de interacción UI/UX</w:t>
+              <w:t>Traspaso al servicio de mantenimiento</w:t>
             </w:r>
           </w:p>
         </w:tc>
@@ -3043,7 +3045,7 @@
                 <w:sz w:val="20"/>
                 <w:szCs w:val="20"/>
               </w:rPr>
-              <w:t>Elaboración del sistema de diseño, pautas de interacción, maquetación base y componentes visuales comunes web y móvil.</w:t>
+              <w:t>Traspaso del repositorio, configuración, relación de defectos abiertos y provisión para la garantía.</w:t>
             </w:r>
           </w:p>
         </w:tc>
@@ -3064,11 +3066,10 @@
             <w:r>
               <w:rPr>
                 <w:b/>
-                <w:bCs/>
-                <w:sz w:val="20"/>
-                <w:szCs w:val="20"/>
-              </w:rPr>
-              <w:t>1.2.1.2</w:t>
+                <w:sz w:val="19"/>
+                <w:szCs w:val="19"/>
+              </w:rPr>
+              <w:t>1.1.10</w:t>
             </w:r>
           </w:p>
         </w:tc>
@@ -3088,13 +3089,10 @@
             </w:pPr>
             <w:r>
               <w:rPr>
-                <w:b/>
-                <w:bCs/>
-                <w:color w:val="548235"/>
-                <w:sz w:val="20"/>
-                <w:szCs w:val="20"/>
-              </w:rPr>
-              <w:t>EP-02</w:t>
+                <w:sz w:val="20"/>
+                <w:szCs w:val="20"/>
+              </w:rPr>
+              <w:t>—</w:t>
             </w:r>
           </w:p>
         </w:tc>
@@ -3174,7 +3172,7 @@
                 <w:sz w:val="20"/>
                 <w:szCs w:val="20"/>
               </w:rPr>
-              <w:t>Especificación y diseño de pruebas de RF-01</w:t>
+              <w:t>Especificación funcional común</w:t>
             </w:r>
           </w:p>
         </w:tc>
@@ -3197,7 +3195,7 @@
                 <w:sz w:val="20"/>
                 <w:szCs w:val="20"/>
               </w:rPr>
-              <w:t>Detalle funcional del registro con validación, login, área personal y diseño de casos de prueba de autenticación.</w:t>
+              <w:t>Definición de especificaciones funcionales comunes y acuerdos de criterios de aceptación con TuSuper.</w:t>
             </w:r>
           </w:p>
         </w:tc>
@@ -3218,11 +3216,10 @@
             <w:r>
               <w:rPr>
                 <w:b/>
-                <w:bCs/>
-                <w:sz w:val="20"/>
-                <w:szCs w:val="20"/>
-              </w:rPr>
-              <w:t>1.2.2.1</w:t>
+                <w:sz w:val="19"/>
+                <w:szCs w:val="19"/>
+              </w:rPr>
+              <w:t>1.2.1.1</w:t>
             </w:r>
           </w:p>
         </w:tc>
@@ -3244,11 +3241,11 @@
               <w:rPr>
                 <w:b/>
                 <w:bCs/>
-                <w:color w:val="1F497D"/>
-                <w:sz w:val="20"/>
-                <w:szCs w:val="20"/>
-              </w:rPr>
-              <w:t>RF-01</w:t>
+                <w:color w:val="548235"/>
+                <w:sz w:val="20"/>
+                <w:szCs w:val="20"/>
+              </w:rPr>
+              <w:t>EP-01</w:t>
             </w:r>
           </w:p>
         </w:tc>
@@ -3273,7 +3270,7 @@
                 <w:sz w:val="20"/>
                 <w:szCs w:val="20"/>
               </w:rPr>
-              <w:t>E</w:t>
+              <w:t>—</w:t>
             </w:r>
           </w:p>
         </w:tc>
@@ -3328,7 +3325,7 @@
                 <w:sz w:val="20"/>
                 <w:szCs w:val="20"/>
               </w:rPr>
-              <w:t>Construcción e integración de RF-01</w:t>
+              <w:t>Diseño del sistema de interacción UI/UX</w:t>
             </w:r>
           </w:p>
         </w:tc>
@@ -3351,23 +3348,7 @@
                 <w:sz w:val="20"/>
                 <w:szCs w:val="20"/>
               </w:rPr>
-              <w:t xml:space="preserve">Codificación de servicios REST de cuentas, servidor de identidad </w:t>
-            </w:r>
-            <w:proofErr w:type="spellStart"/>
-            <w:r>
-              <w:rPr>
-                <w:sz w:val="20"/>
-                <w:szCs w:val="20"/>
-              </w:rPr>
-              <w:t>OpenID</w:t>
-            </w:r>
-            <w:proofErr w:type="spellEnd"/>
-            <w:r>
-              <w:rPr>
-                <w:sz w:val="20"/>
-                <w:szCs w:val="20"/>
-              </w:rPr>
-              <w:t>/OAuth, vistas web y móviles integradas en rama principal.</w:t>
+              <w:t>Elaboración del sistema de diseño, pautas de interacción, maquetación base y componentes visuales comunes web y móvil.</w:t>
             </w:r>
           </w:p>
         </w:tc>
@@ -3388,11 +3369,10 @@
             <w:r>
               <w:rPr>
                 <w:b/>
-                <w:bCs/>
-                <w:sz w:val="20"/>
-                <w:szCs w:val="20"/>
-              </w:rPr>
-              <w:t>1.2.2.2</w:t>
+                <w:sz w:val="19"/>
+                <w:szCs w:val="19"/>
+              </w:rPr>
+              <w:t>1.2.1.1</w:t>
             </w:r>
           </w:p>
         </w:tc>
@@ -3414,11 +3394,11 @@
               <w:rPr>
                 <w:b/>
                 <w:bCs/>
-                <w:color w:val="1F497D"/>
-                <w:sz w:val="20"/>
-                <w:szCs w:val="20"/>
-              </w:rPr>
-              <w:t>RF-01</w:t>
+                <w:color w:val="548235"/>
+                <w:sz w:val="20"/>
+                <w:szCs w:val="20"/>
+              </w:rPr>
+              <w:t>EP-02</w:t>
             </w:r>
           </w:p>
         </w:tc>
@@ -3443,7 +3423,7 @@
                 <w:sz w:val="20"/>
                 <w:szCs w:val="20"/>
               </w:rPr>
-              <w:t>C</w:t>
+              <w:t>—</w:t>
             </w:r>
           </w:p>
         </w:tc>
@@ -3498,7 +3478,7 @@
                 <w:sz w:val="20"/>
                 <w:szCs w:val="20"/>
               </w:rPr>
-              <w:t>Verificación de RF-01</w:t>
+              <w:t>Especificación y diseño de pruebas de RF-01</w:t>
             </w:r>
           </w:p>
         </w:tc>
@@ -3521,7 +3501,7 @@
                 <w:sz w:val="20"/>
                 <w:szCs w:val="20"/>
               </w:rPr>
-              <w:t>Pruebas de sistema, validación de flujos de autenticación y revisión con el cliente en el entorno de verificación.</w:t>
+              <w:t>Detalle funcional del registro con validación, login, área personal y diseño de casos de prueba de autenticación.</w:t>
             </w:r>
           </w:p>
         </w:tc>
@@ -3542,11 +3522,10 @@
             <w:r>
               <w:rPr>
                 <w:b/>
-                <w:bCs/>
-                <w:sz w:val="20"/>
-                <w:szCs w:val="20"/>
-              </w:rPr>
-              <w:t>1.2.2.3</w:t>
+                <w:sz w:val="19"/>
+                <w:szCs w:val="19"/>
+              </w:rPr>
+              <w:t>1.2.3.1</w:t>
             </w:r>
           </w:p>
         </w:tc>
@@ -3597,7 +3576,7 @@
                 <w:sz w:val="20"/>
                 <w:szCs w:val="20"/>
               </w:rPr>
-              <w:t>V</w:t>
+              <w:t>E</w:t>
             </w:r>
           </w:p>
         </w:tc>
@@ -3652,7 +3631,7 @@
                 <w:sz w:val="20"/>
                 <w:szCs w:val="20"/>
               </w:rPr>
-              <w:t>Especificación y diseño de pruebas de RF-02</w:t>
+              <w:t>Construcción e integración de RF-01</w:t>
             </w:r>
           </w:p>
         </w:tc>
@@ -3675,7 +3654,7 @@
                 <w:sz w:val="20"/>
                 <w:szCs w:val="20"/>
               </w:rPr>
-              <w:t>Detalle de navegación por categorías, filtros por marca/formato, buscador con sugerencias y diseño de pruebas.</w:t>
+              <w:t>Codificación de servicios REST de cuentas, servidor de identidad OpenID/OAuth, vistas web y móviles integradas en rama principal.</w:t>
             </w:r>
           </w:p>
         </w:tc>
@@ -3696,11 +3675,10 @@
             <w:r>
               <w:rPr>
                 <w:b/>
-                <w:bCs/>
-                <w:sz w:val="20"/>
-                <w:szCs w:val="20"/>
-              </w:rPr>
-              <w:t>1.2.2.1</w:t>
+                <w:sz w:val="19"/>
+                <w:szCs w:val="19"/>
+              </w:rPr>
+              <w:t>1.2.3.1</w:t>
             </w:r>
           </w:p>
         </w:tc>
@@ -3726,7 +3704,7 @@
                 <w:sz w:val="20"/>
                 <w:szCs w:val="20"/>
               </w:rPr>
-              <w:t>RF-02</w:t>
+              <w:t>RF-01</w:t>
             </w:r>
           </w:p>
         </w:tc>
@@ -3751,7 +3729,7 @@
                 <w:sz w:val="20"/>
                 <w:szCs w:val="20"/>
               </w:rPr>
-              <w:t>E</w:t>
+              <w:t>C</w:t>
             </w:r>
           </w:p>
         </w:tc>
@@ -3783,7 +3761,6 @@
                 <w:sz w:val="20"/>
                 <w:szCs w:val="20"/>
               </w:rPr>
-              <w:lastRenderedPageBreak/>
               <w:t>ACT-16</w:t>
             </w:r>
           </w:p>
@@ -3807,7 +3784,7 @@
                 <w:sz w:val="20"/>
                 <w:szCs w:val="20"/>
               </w:rPr>
-              <w:t>Construcción e integración de RF-02</w:t>
+              <w:t>Verificación de RF-01</w:t>
             </w:r>
           </w:p>
         </w:tc>
@@ -3830,23 +3807,7 @@
                 <w:sz w:val="20"/>
                 <w:szCs w:val="20"/>
               </w:rPr>
-              <w:t xml:space="preserve">Desarrollo del servicio de catálogo, </w:t>
-            </w:r>
-            <w:proofErr w:type="spellStart"/>
-            <w:r>
-              <w:rPr>
-                <w:sz w:val="20"/>
-                <w:szCs w:val="20"/>
-              </w:rPr>
-              <w:t>endpoints</w:t>
-            </w:r>
-            <w:proofErr w:type="spellEnd"/>
-            <w:r>
-              <w:rPr>
-                <w:sz w:val="20"/>
-                <w:szCs w:val="20"/>
-              </w:rPr>
-              <w:t xml:space="preserve"> de búsqueda, componentes de interfaz web/móvil e integración continua.</w:t>
+              <w:t>Pruebas de sistema, validación de flujos de autenticación y revisión con el cliente en el entorno de verificación.</w:t>
             </w:r>
           </w:p>
         </w:tc>
@@ -3860,18 +3821,19 @@
               <w:spacing w:before="120" w:after="120"/>
               <w:rPr>
                 <w:b/>
-                <w:sz w:val="19"/>
-                <w:szCs w:val="19"/>
-              </w:rPr>
-            </w:pPr>
-            <w:r>
-              <w:rPr>
-                <w:b/>
-                <w:bCs/>
-                <w:sz w:val="20"/>
-                <w:szCs w:val="20"/>
-              </w:rPr>
-              <w:t>1.2.2.2</w:t>
+                <w:bCs/>
+                <w:sz w:val="19"/>
+                <w:szCs w:val="19"/>
+              </w:rPr>
+            </w:pPr>
+            <w:r>
+              <w:rPr>
+                <w:b/>
+                <w:bCs/>
+                <w:sz w:val="20"/>
+                <w:szCs w:val="20"/>
+              </w:rPr>
+              <w:t>1.2.3.1</w:t>
             </w:r>
           </w:p>
         </w:tc>
@@ -3897,7 +3859,7 @@
                 <w:sz w:val="20"/>
                 <w:szCs w:val="20"/>
               </w:rPr>
-              <w:t>RF-02</w:t>
+              <w:t>RF-01</w:t>
             </w:r>
           </w:p>
         </w:tc>
@@ -3922,7 +3884,7 @@
                 <w:sz w:val="20"/>
                 <w:szCs w:val="20"/>
               </w:rPr>
-              <w:t>C</w:t>
+              <w:t>V</w:t>
             </w:r>
           </w:p>
         </w:tc>
@@ -3977,7 +3939,7 @@
                 <w:sz w:val="20"/>
                 <w:szCs w:val="20"/>
               </w:rPr>
-              <w:t>Verificación de RF-02</w:t>
+              <w:t>Especificación y diseño de pruebas de RF-02</w:t>
             </w:r>
           </w:p>
         </w:tc>
@@ -4000,7 +3962,7 @@
                 <w:sz w:val="20"/>
                 <w:szCs w:val="20"/>
               </w:rPr>
-              <w:t>Verificación de rendimiento de búsquedas, filtros y visualización de fichas en entorno de verificación.</w:t>
+              <w:t>Detalle de navegación por categorías, filtros por marca/formato, buscador con sugerencias y diseño de pruebas.</w:t>
             </w:r>
           </w:p>
         </w:tc>
@@ -4014,18 +3976,19 @@
               <w:spacing w:before="120" w:after="120"/>
               <w:rPr>
                 <w:b/>
-                <w:sz w:val="19"/>
-                <w:szCs w:val="19"/>
-              </w:rPr>
-            </w:pPr>
-            <w:r>
-              <w:rPr>
-                <w:b/>
-                <w:bCs/>
-                <w:sz w:val="20"/>
-                <w:szCs w:val="20"/>
-              </w:rPr>
-              <w:t>1.2.2.3</w:t>
+                <w:bCs/>
+                <w:sz w:val="19"/>
+                <w:szCs w:val="19"/>
+              </w:rPr>
+            </w:pPr>
+            <w:r>
+              <w:rPr>
+                <w:b/>
+                <w:bCs/>
+                <w:sz w:val="19"/>
+                <w:szCs w:val="19"/>
+              </w:rPr>
+              <w:t>1.2.3.2</w:t>
             </w:r>
           </w:p>
         </w:tc>
@@ -4076,7 +4039,7 @@
                 <w:sz w:val="20"/>
                 <w:szCs w:val="20"/>
               </w:rPr>
-              <w:t>V</w:t>
+              <w:t>E</w:t>
             </w:r>
           </w:p>
         </w:tc>
@@ -4131,7 +4094,7 @@
                 <w:sz w:val="20"/>
                 <w:szCs w:val="20"/>
               </w:rPr>
-              <w:t>Especificación y diseño de pruebas de RF-03</w:t>
+              <w:t>Construcción e integración de RF-02</w:t>
             </w:r>
           </w:p>
         </w:tc>
@@ -4154,7 +4117,7 @@
                 <w:sz w:val="20"/>
                 <w:szCs w:val="20"/>
               </w:rPr>
-              <w:t>Definición de persistencia multisesión/dispositivo, reglas de guardado para más tarde y diseño de pruebas.</w:t>
+              <w:t>Desarrollo del servicio de catálogo, endpoints de búsqueda, componentes de interfaz web/móvil e integración continua.</w:t>
             </w:r>
           </w:p>
         </w:tc>
@@ -4168,18 +4131,28 @@
               <w:spacing w:before="120" w:after="120"/>
               <w:rPr>
                 <w:b/>
-                <w:sz w:val="19"/>
-                <w:szCs w:val="19"/>
-              </w:rPr>
-            </w:pPr>
-            <w:r>
-              <w:rPr>
-                <w:b/>
-                <w:bCs/>
-                <w:sz w:val="20"/>
-                <w:szCs w:val="20"/>
-              </w:rPr>
-              <w:t>1.2.3.1</w:t>
+                <w:bCs/>
+                <w:sz w:val="19"/>
+                <w:szCs w:val="19"/>
+              </w:rPr>
+            </w:pPr>
+            <w:r>
+              <w:rPr>
+                <w:b/>
+                <w:bCs/>
+                <w:sz w:val="20"/>
+                <w:szCs w:val="20"/>
+              </w:rPr>
+              <w:t>1.2</w:t>
+            </w:r>
+            <w:r>
+              <w:rPr>
+                <w:b/>
+                <w:bCs/>
+                <w:sz w:val="20"/>
+                <w:szCs w:val="20"/>
+              </w:rPr>
+              <w:t>.3.2</w:t>
             </w:r>
           </w:p>
         </w:tc>
@@ -4205,7 +4178,7 @@
                 <w:sz w:val="20"/>
                 <w:szCs w:val="20"/>
               </w:rPr>
-              <w:t>RF-03</w:t>
+              <w:t>RF-02</w:t>
             </w:r>
           </w:p>
         </w:tc>
@@ -4230,7 +4203,7 @@
                 <w:sz w:val="20"/>
                 <w:szCs w:val="20"/>
               </w:rPr>
-              <w:t>E</w:t>
+              <w:t>C</w:t>
             </w:r>
           </w:p>
         </w:tc>
@@ -4285,7 +4258,7 @@
                 <w:sz w:val="20"/>
                 <w:szCs w:val="20"/>
               </w:rPr>
-              <w:t>Construcción e integración de RF-03</w:t>
+              <w:t>Verificación de RF-02</w:t>
             </w:r>
           </w:p>
         </w:tc>
@@ -4308,23 +4281,7 @@
                 <w:sz w:val="20"/>
                 <w:szCs w:val="20"/>
               </w:rPr>
-              <w:t xml:space="preserve">Programación del servicio de cesta de la compra, almacenamiento en base de datos PostgreSQL e integración en </w:t>
-            </w:r>
-            <w:proofErr w:type="gramStart"/>
-            <w:r>
-              <w:rPr>
-                <w:sz w:val="20"/>
-                <w:szCs w:val="20"/>
-              </w:rPr>
-              <w:t>apps</w:t>
-            </w:r>
-            <w:proofErr w:type="gramEnd"/>
-            <w:r>
-              <w:rPr>
-                <w:sz w:val="20"/>
-                <w:szCs w:val="20"/>
-              </w:rPr>
-              <w:t>.</w:t>
+              <w:t>Verificación de rendimiento de búsquedas, filtros y visualización de fichas en entorno de verificación.</w:t>
             </w:r>
           </w:p>
         </w:tc>
@@ -4338,18 +4295,28 @@
               <w:spacing w:before="120" w:after="120"/>
               <w:rPr>
                 <w:b/>
-                <w:sz w:val="19"/>
-                <w:szCs w:val="19"/>
-              </w:rPr>
-            </w:pPr>
-            <w:r>
-              <w:rPr>
-                <w:b/>
-                <w:bCs/>
-                <w:sz w:val="20"/>
-                <w:szCs w:val="20"/>
-              </w:rPr>
-              <w:t>1.2.3.2</w:t>
+                <w:bCs/>
+                <w:sz w:val="19"/>
+                <w:szCs w:val="19"/>
+              </w:rPr>
+            </w:pPr>
+            <w:r>
+              <w:rPr>
+                <w:b/>
+                <w:bCs/>
+                <w:sz w:val="20"/>
+                <w:szCs w:val="20"/>
+              </w:rPr>
+              <w:t>1.2.</w:t>
+            </w:r>
+            <w:r>
+              <w:rPr>
+                <w:b/>
+                <w:bCs/>
+                <w:sz w:val="20"/>
+                <w:szCs w:val="20"/>
+              </w:rPr>
+              <w:t>3.2</w:t>
             </w:r>
           </w:p>
         </w:tc>
@@ -4375,7 +4342,7 @@
                 <w:sz w:val="20"/>
                 <w:szCs w:val="20"/>
               </w:rPr>
-              <w:t>RF-03</w:t>
+              <w:t>RF-02</w:t>
             </w:r>
           </w:p>
         </w:tc>
@@ -4400,7 +4367,7 @@
                 <w:sz w:val="20"/>
                 <w:szCs w:val="20"/>
               </w:rPr>
-              <w:t>C</w:t>
+              <w:t>V</w:t>
             </w:r>
           </w:p>
         </w:tc>
@@ -4455,7 +4422,7 @@
                 <w:sz w:val="20"/>
                 <w:szCs w:val="20"/>
               </w:rPr>
-              <w:t>Verificación de RF-03</w:t>
+              <w:t>Especificación y diseño de pruebas de RF-03</w:t>
             </w:r>
           </w:p>
         </w:tc>
@@ -4478,7 +4445,7 @@
                 <w:sz w:val="20"/>
                 <w:szCs w:val="20"/>
               </w:rPr>
-              <w:t>Pruebas de sistema de persistencia entre navegador y móvil y validación funcional con usuarios.</w:t>
+              <w:t>Definición de persistencia multisesión/dispositivo, reglas de guardado para más tarde y diseño de pruebas.</w:t>
             </w:r>
           </w:p>
         </w:tc>
@@ -4492,18 +4459,28 @@
               <w:spacing w:before="120" w:after="120"/>
               <w:rPr>
                 <w:b/>
-                <w:sz w:val="19"/>
-                <w:szCs w:val="19"/>
-              </w:rPr>
-            </w:pPr>
-            <w:r>
-              <w:rPr>
-                <w:b/>
-                <w:bCs/>
-                <w:sz w:val="20"/>
-                <w:szCs w:val="20"/>
-              </w:rPr>
-              <w:t>1.2.3.3</w:t>
+                <w:bCs/>
+                <w:sz w:val="19"/>
+                <w:szCs w:val="19"/>
+              </w:rPr>
+            </w:pPr>
+            <w:r>
+              <w:rPr>
+                <w:b/>
+                <w:bCs/>
+                <w:sz w:val="20"/>
+                <w:szCs w:val="20"/>
+              </w:rPr>
+              <w:t>1.2</w:t>
+            </w:r>
+            <w:r>
+              <w:rPr>
+                <w:b/>
+                <w:bCs/>
+                <w:sz w:val="20"/>
+                <w:szCs w:val="20"/>
+              </w:rPr>
+              <w:t>.4.1</w:t>
             </w:r>
           </w:p>
         </w:tc>
@@ -4554,7 +4531,7 @@
                 <w:sz w:val="20"/>
                 <w:szCs w:val="20"/>
               </w:rPr>
-              <w:t>V</w:t>
+              <w:t>E</w:t>
             </w:r>
           </w:p>
         </w:tc>
@@ -4609,7 +4586,7 @@
                 <w:sz w:val="20"/>
                 <w:szCs w:val="20"/>
               </w:rPr>
-              <w:t>Especificación y diseño de pruebas de RF-04</w:t>
+              <w:t>Construcción e integración de RF-03</w:t>
             </w:r>
           </w:p>
         </w:tc>
@@ -4632,23 +4609,7 @@
                 <w:sz w:val="20"/>
                 <w:szCs w:val="20"/>
               </w:rPr>
-              <w:t xml:space="preserve">Especificación técnica de integración con la pasarela externa de pago, diseño de pantallas de </w:t>
-            </w:r>
-            <w:proofErr w:type="spellStart"/>
-            <w:r>
-              <w:rPr>
-                <w:sz w:val="20"/>
-                <w:szCs w:val="20"/>
-              </w:rPr>
-              <w:t>checkout</w:t>
-            </w:r>
-            <w:proofErr w:type="spellEnd"/>
-            <w:r>
-              <w:rPr>
-                <w:sz w:val="20"/>
-                <w:szCs w:val="20"/>
-              </w:rPr>
-              <w:t xml:space="preserve"> y casos de prueba.</w:t>
+              <w:t>Programación del servicio de cesta de la compra, almacenamiento en base de datos PostgreSQL e integración en apps.</w:t>
             </w:r>
           </w:p>
         </w:tc>
@@ -4662,18 +4623,28 @@
               <w:spacing w:before="120" w:after="120"/>
               <w:rPr>
                 <w:b/>
-                <w:sz w:val="19"/>
-                <w:szCs w:val="19"/>
-              </w:rPr>
-            </w:pPr>
-            <w:r>
-              <w:rPr>
-                <w:b/>
-                <w:bCs/>
-                <w:sz w:val="20"/>
-                <w:szCs w:val="20"/>
-              </w:rPr>
-              <w:t>1.2.3.1</w:t>
+                <w:bCs/>
+                <w:sz w:val="19"/>
+                <w:szCs w:val="19"/>
+              </w:rPr>
+            </w:pPr>
+            <w:r>
+              <w:rPr>
+                <w:b/>
+                <w:bCs/>
+                <w:sz w:val="20"/>
+                <w:szCs w:val="20"/>
+              </w:rPr>
+              <w:t>1.2.</w:t>
+            </w:r>
+            <w:r>
+              <w:rPr>
+                <w:b/>
+                <w:bCs/>
+                <w:sz w:val="20"/>
+                <w:szCs w:val="20"/>
+              </w:rPr>
+              <w:t>4.1</w:t>
             </w:r>
           </w:p>
         </w:tc>
@@ -4699,7 +4670,7 @@
                 <w:sz w:val="20"/>
                 <w:szCs w:val="20"/>
               </w:rPr>
-              <w:t>RF-04</w:t>
+              <w:t>RF-03</w:t>
             </w:r>
           </w:p>
         </w:tc>
@@ -4724,7 +4695,7 @@
                 <w:sz w:val="20"/>
                 <w:szCs w:val="20"/>
               </w:rPr>
-              <w:t>E</w:t>
+              <w:t>C</w:t>
             </w:r>
           </w:p>
         </w:tc>
@@ -4779,7 +4750,7 @@
                 <w:sz w:val="20"/>
                 <w:szCs w:val="20"/>
               </w:rPr>
-              <w:t>Construcción e integración de RF-04</w:t>
+              <w:t>Verificación de RF-03</w:t>
             </w:r>
           </w:p>
         </w:tc>
@@ -4802,7 +4773,7 @@
                 <w:sz w:val="20"/>
                 <w:szCs w:val="20"/>
               </w:rPr>
-              <w:t>Implementación del servicio de pagos, tokenización segura (sin almacenar tarjetas) y confirmación de cobro.</w:t>
+              <w:t>Pruebas de sistema de persistencia entre navegador y móvil y validación funcional con usuarios.</w:t>
             </w:r>
           </w:p>
         </w:tc>
@@ -4816,18 +4787,28 @@
               <w:spacing w:before="120" w:after="120"/>
               <w:rPr>
                 <w:b/>
-                <w:sz w:val="19"/>
-                <w:szCs w:val="19"/>
-              </w:rPr>
-            </w:pPr>
-            <w:r>
-              <w:rPr>
-                <w:b/>
-                <w:bCs/>
-                <w:sz w:val="20"/>
-                <w:szCs w:val="20"/>
-              </w:rPr>
-              <w:t>1.2.3.2</w:t>
+                <w:bCs/>
+                <w:sz w:val="19"/>
+                <w:szCs w:val="19"/>
+              </w:rPr>
+            </w:pPr>
+            <w:r>
+              <w:rPr>
+                <w:b/>
+                <w:bCs/>
+                <w:sz w:val="20"/>
+                <w:szCs w:val="20"/>
+              </w:rPr>
+              <w:t>1.2.</w:t>
+            </w:r>
+            <w:r>
+              <w:rPr>
+                <w:b/>
+                <w:bCs/>
+                <w:sz w:val="20"/>
+                <w:szCs w:val="20"/>
+              </w:rPr>
+              <w:t>4.1</w:t>
             </w:r>
           </w:p>
         </w:tc>
@@ -4853,7 +4834,7 @@
                 <w:sz w:val="20"/>
                 <w:szCs w:val="20"/>
               </w:rPr>
-              <w:t>RF-04</w:t>
+              <w:t>RF-03</w:t>
             </w:r>
           </w:p>
         </w:tc>
@@ -4878,7 +4859,7 @@
                 <w:sz w:val="20"/>
                 <w:szCs w:val="20"/>
               </w:rPr>
-              <w:t>C</w:t>
+              <w:t>V</w:t>
             </w:r>
           </w:p>
         </w:tc>
@@ -4933,7 +4914,7 @@
                 <w:sz w:val="20"/>
                 <w:szCs w:val="20"/>
               </w:rPr>
-              <w:t>Verificación de RF-04</w:t>
+              <w:t>Especificación y diseño de pruebas de RF-04</w:t>
             </w:r>
           </w:p>
         </w:tc>
@@ -4956,7 +4937,7 @@
                 <w:sz w:val="20"/>
                 <w:szCs w:val="20"/>
               </w:rPr>
-              <w:t>Pruebas transaccionales en modo de pruebas contra la pasarela externa en entorno de verificación.</w:t>
+              <w:t>Especificación técnica de integración con la pasarela externa de pago, diseño de pantallas de checkout y casos de prueba.</w:t>
             </w:r>
           </w:p>
         </w:tc>
@@ -4970,18 +4951,28 @@
               <w:spacing w:before="120" w:after="120"/>
               <w:rPr>
                 <w:b/>
-                <w:sz w:val="19"/>
-                <w:szCs w:val="19"/>
-              </w:rPr>
-            </w:pPr>
-            <w:r>
-              <w:rPr>
-                <w:b/>
-                <w:bCs/>
-                <w:sz w:val="20"/>
-                <w:szCs w:val="20"/>
-              </w:rPr>
-              <w:t>1.2.3.3</w:t>
+                <w:bCs/>
+                <w:sz w:val="19"/>
+                <w:szCs w:val="19"/>
+              </w:rPr>
+            </w:pPr>
+            <w:r>
+              <w:rPr>
+                <w:b/>
+                <w:bCs/>
+                <w:sz w:val="20"/>
+                <w:szCs w:val="20"/>
+              </w:rPr>
+              <w:t>1.2.</w:t>
+            </w:r>
+            <w:r>
+              <w:rPr>
+                <w:b/>
+                <w:bCs/>
+                <w:sz w:val="20"/>
+                <w:szCs w:val="20"/>
+              </w:rPr>
+              <w:t>4.2</w:t>
             </w:r>
           </w:p>
         </w:tc>
@@ -5032,7 +5023,7 @@
                 <w:sz w:val="20"/>
                 <w:szCs w:val="20"/>
               </w:rPr>
-              <w:t>V</w:t>
+              <w:t>E</w:t>
             </w:r>
           </w:p>
         </w:tc>
@@ -5087,7 +5078,7 @@
                 <w:sz w:val="20"/>
                 <w:szCs w:val="20"/>
               </w:rPr>
-              <w:t>Especificación y diseño de pruebas de RF-05</w:t>
+              <w:t>Construcción e integración de RF-04</w:t>
             </w:r>
           </w:p>
         </w:tc>
@@ -5110,7 +5101,7 @@
                 <w:sz w:val="20"/>
                 <w:szCs w:val="20"/>
               </w:rPr>
-              <w:t>Definición de cálculo de zonas de cobertura por CP, gestión de franjas horarias, cupos y diseño de pruebas.</w:t>
+              <w:t>Implementación del servicio de pagos, tokenización segura (sin almacenar tarjetas) y confirmación de cobro.</w:t>
             </w:r>
           </w:p>
         </w:tc>
@@ -5124,18 +5115,28 @@
               <w:spacing w:before="120" w:after="120"/>
               <w:rPr>
                 <w:b/>
-                <w:sz w:val="19"/>
-                <w:szCs w:val="19"/>
-              </w:rPr>
-            </w:pPr>
-            <w:r>
-              <w:rPr>
-                <w:b/>
-                <w:bCs/>
-                <w:sz w:val="20"/>
-                <w:szCs w:val="20"/>
-              </w:rPr>
-              <w:t>1.2.4.1</w:t>
+                <w:bCs/>
+                <w:sz w:val="19"/>
+                <w:szCs w:val="19"/>
+              </w:rPr>
+            </w:pPr>
+            <w:r>
+              <w:rPr>
+                <w:b/>
+                <w:bCs/>
+                <w:sz w:val="20"/>
+                <w:szCs w:val="20"/>
+              </w:rPr>
+              <w:t>1.2.</w:t>
+            </w:r>
+            <w:r>
+              <w:rPr>
+                <w:b/>
+                <w:bCs/>
+                <w:sz w:val="20"/>
+                <w:szCs w:val="20"/>
+              </w:rPr>
+              <w:t>4.2</w:t>
             </w:r>
           </w:p>
         </w:tc>
@@ -5161,7 +5162,7 @@
                 <w:sz w:val="20"/>
                 <w:szCs w:val="20"/>
               </w:rPr>
-              <w:t>RF-05</w:t>
+              <w:t>RF-04</w:t>
             </w:r>
           </w:p>
         </w:tc>
@@ -5186,7 +5187,7 @@
                 <w:sz w:val="20"/>
                 <w:szCs w:val="20"/>
               </w:rPr>
-              <w:t>E</w:t>
+              <w:t>C</w:t>
             </w:r>
           </w:p>
         </w:tc>
@@ -5241,7 +5242,7 @@
                 <w:sz w:val="20"/>
                 <w:szCs w:val="20"/>
               </w:rPr>
-              <w:t>Construcción e integración de RF-05</w:t>
+              <w:t>Verificación de RF-04</w:t>
             </w:r>
           </w:p>
         </w:tc>
@@ -5264,7 +5265,7 @@
                 <w:sz w:val="20"/>
                 <w:szCs w:val="20"/>
               </w:rPr>
-              <w:t>Desarrollo del servicio de entregas, asignación de repartidores y componentes de selección de franja en web y móvil.</w:t>
+              <w:t>Pruebas transaccionales en modo de pruebas contra la pasarela externa en entorno de verificación.</w:t>
             </w:r>
           </w:p>
         </w:tc>
@@ -5278,18 +5279,28 @@
               <w:spacing w:before="120" w:after="120"/>
               <w:rPr>
                 <w:b/>
-                <w:sz w:val="19"/>
-                <w:szCs w:val="19"/>
-              </w:rPr>
-            </w:pPr>
-            <w:r>
-              <w:rPr>
-                <w:b/>
-                <w:bCs/>
-                <w:sz w:val="20"/>
-                <w:szCs w:val="20"/>
-              </w:rPr>
-              <w:t>1.2.4.2</w:t>
+                <w:bCs/>
+                <w:sz w:val="19"/>
+                <w:szCs w:val="19"/>
+              </w:rPr>
+            </w:pPr>
+            <w:r>
+              <w:rPr>
+                <w:b/>
+                <w:bCs/>
+                <w:sz w:val="20"/>
+                <w:szCs w:val="20"/>
+              </w:rPr>
+              <w:t>1.2.</w:t>
+            </w:r>
+            <w:r>
+              <w:rPr>
+                <w:b/>
+                <w:bCs/>
+                <w:sz w:val="20"/>
+                <w:szCs w:val="20"/>
+              </w:rPr>
+              <w:t>4.2</w:t>
             </w:r>
           </w:p>
         </w:tc>
@@ -5315,7 +5326,7 @@
                 <w:sz w:val="20"/>
                 <w:szCs w:val="20"/>
               </w:rPr>
-              <w:t>RF-05</w:t>
+              <w:t>RF-04</w:t>
             </w:r>
           </w:p>
         </w:tc>
@@ -5340,7 +5351,7 @@
                 <w:sz w:val="20"/>
                 <w:szCs w:val="20"/>
               </w:rPr>
-              <w:t>C</w:t>
+              <w:t>V</w:t>
             </w:r>
           </w:p>
         </w:tc>
@@ -5395,7 +5406,7 @@
                 <w:sz w:val="20"/>
                 <w:szCs w:val="20"/>
               </w:rPr>
-              <w:t>Verificación de RF-05</w:t>
+              <w:t>Especificación y diseño de pruebas de RF-05</w:t>
             </w:r>
           </w:p>
         </w:tc>
@@ -5418,7 +5429,7 @@
                 <w:sz w:val="20"/>
                 <w:szCs w:val="20"/>
               </w:rPr>
-              <w:t>Pruebas de cobertura geográfica por código postal y control de capacidad máxima por franja horaria.</w:t>
+              <w:t>Definición de cálculo de zonas de cobertura por CP, gestión de franjas horarias, cupos y diseño de pruebas.</w:t>
             </w:r>
           </w:p>
         </w:tc>
@@ -5432,18 +5443,28 @@
               <w:spacing w:before="120" w:after="120"/>
               <w:rPr>
                 <w:b/>
-                <w:sz w:val="19"/>
-                <w:szCs w:val="19"/>
-              </w:rPr>
-            </w:pPr>
-            <w:r>
-              <w:rPr>
-                <w:b/>
-                <w:bCs/>
-                <w:sz w:val="20"/>
-                <w:szCs w:val="20"/>
-              </w:rPr>
-              <w:t>1.2.4.3</w:t>
+                <w:bCs/>
+                <w:sz w:val="19"/>
+                <w:szCs w:val="19"/>
+              </w:rPr>
+            </w:pPr>
+            <w:r>
+              <w:rPr>
+                <w:b/>
+                <w:bCs/>
+                <w:sz w:val="20"/>
+                <w:szCs w:val="20"/>
+              </w:rPr>
+              <w:t>1.2.4.</w:t>
+            </w:r>
+            <w:r>
+              <w:rPr>
+                <w:b/>
+                <w:bCs/>
+                <w:sz w:val="20"/>
+                <w:szCs w:val="20"/>
+              </w:rPr>
+              <w:t>3</w:t>
             </w:r>
           </w:p>
         </w:tc>
@@ -5494,7 +5515,7 @@
                 <w:sz w:val="20"/>
                 <w:szCs w:val="20"/>
               </w:rPr>
-              <w:t>V</w:t>
+              <w:t>E</w:t>
             </w:r>
           </w:p>
         </w:tc>
@@ -5549,7 +5570,7 @@
                 <w:sz w:val="20"/>
                 <w:szCs w:val="20"/>
               </w:rPr>
-              <w:t>Especificación y diseño de pruebas de RF-06</w:t>
+              <w:t>Construcción e integración de RF-05</w:t>
             </w:r>
           </w:p>
         </w:tc>
@@ -5572,7 +5593,7 @@
                 <w:sz w:val="20"/>
                 <w:szCs w:val="20"/>
               </w:rPr>
-              <w:t>Diseño de interacción del panel de tienda, flujos de preparación de pedidos, cambios de estado y diseño de pruebas.</w:t>
+              <w:t>Desarrollo del servicio de entregas, asignación de repartidores y componentes de selección de franja en web y móvil.</w:t>
             </w:r>
           </w:p>
         </w:tc>
@@ -5586,18 +5607,28 @@
               <w:spacing w:before="120" w:after="120"/>
               <w:rPr>
                 <w:b/>
-                <w:sz w:val="19"/>
-                <w:szCs w:val="19"/>
-              </w:rPr>
-            </w:pPr>
-            <w:r>
-              <w:rPr>
-                <w:b/>
-                <w:bCs/>
-                <w:sz w:val="20"/>
-                <w:szCs w:val="20"/>
-              </w:rPr>
-              <w:t>1.2.4.1</w:t>
+                <w:bCs/>
+                <w:sz w:val="19"/>
+                <w:szCs w:val="19"/>
+              </w:rPr>
+            </w:pPr>
+            <w:r>
+              <w:rPr>
+                <w:b/>
+                <w:bCs/>
+                <w:sz w:val="20"/>
+                <w:szCs w:val="20"/>
+              </w:rPr>
+              <w:t>1.2.</w:t>
+            </w:r>
+            <w:r>
+              <w:rPr>
+                <w:b/>
+                <w:bCs/>
+                <w:sz w:val="20"/>
+                <w:szCs w:val="20"/>
+              </w:rPr>
+              <w:t>5.1</w:t>
             </w:r>
           </w:p>
         </w:tc>
@@ -5623,7 +5654,7 @@
                 <w:sz w:val="20"/>
                 <w:szCs w:val="20"/>
               </w:rPr>
-              <w:t>RF-06</w:t>
+              <w:t>RF-05</w:t>
             </w:r>
           </w:p>
         </w:tc>
@@ -5648,7 +5679,7 @@
                 <w:sz w:val="20"/>
                 <w:szCs w:val="20"/>
               </w:rPr>
-              <w:t>E</w:t>
+              <w:t>C</w:t>
             </w:r>
           </w:p>
         </w:tc>
@@ -5680,7 +5711,6 @@
                 <w:sz w:val="20"/>
                 <w:szCs w:val="20"/>
               </w:rPr>
-              <w:lastRenderedPageBreak/>
               <w:t>ACT-28</w:t>
             </w:r>
           </w:p>
@@ -5704,7 +5734,7 @@
                 <w:sz w:val="20"/>
                 <w:szCs w:val="20"/>
               </w:rPr>
-              <w:t>Construcción e integración de RF-06</w:t>
+              <w:t>Verificación de RF-05</w:t>
             </w:r>
           </w:p>
         </w:tc>
@@ -5727,7 +5757,7 @@
                 <w:sz w:val="20"/>
                 <w:szCs w:val="20"/>
               </w:rPr>
-              <w:t>Desarrollo de la aplicación web del panel de tienda, servicio de pedidos de tienda y sincronización de estados.</w:t>
+              <w:t>Pruebas de cobertura geográfica por código postal y control de capacidad máxima por franja horaria.</w:t>
             </w:r>
           </w:p>
         </w:tc>
@@ -5741,18 +5771,28 @@
               <w:spacing w:before="120" w:after="120"/>
               <w:rPr>
                 <w:b/>
-                <w:sz w:val="19"/>
-                <w:szCs w:val="19"/>
-              </w:rPr>
-            </w:pPr>
-            <w:r>
-              <w:rPr>
-                <w:b/>
-                <w:bCs/>
-                <w:sz w:val="20"/>
-                <w:szCs w:val="20"/>
-              </w:rPr>
-              <w:t>1.2.4.2</w:t>
+                <w:bCs/>
+                <w:sz w:val="19"/>
+                <w:szCs w:val="19"/>
+              </w:rPr>
+            </w:pPr>
+            <w:r>
+              <w:rPr>
+                <w:b/>
+                <w:bCs/>
+                <w:sz w:val="20"/>
+                <w:szCs w:val="20"/>
+              </w:rPr>
+              <w:t>1.2.</w:t>
+            </w:r>
+            <w:r>
+              <w:rPr>
+                <w:b/>
+                <w:bCs/>
+                <w:sz w:val="20"/>
+                <w:szCs w:val="20"/>
+              </w:rPr>
+              <w:t>5.1</w:t>
             </w:r>
           </w:p>
         </w:tc>
@@ -5778,7 +5818,7 @@
                 <w:sz w:val="20"/>
                 <w:szCs w:val="20"/>
               </w:rPr>
-              <w:t>RF-06</w:t>
+              <w:t>RF-05</w:t>
             </w:r>
           </w:p>
         </w:tc>
@@ -5803,7 +5843,7 @@
                 <w:sz w:val="20"/>
                 <w:szCs w:val="20"/>
               </w:rPr>
-              <w:t>C</w:t>
+              <w:t>V</w:t>
             </w:r>
           </w:p>
         </w:tc>
@@ -5858,7 +5898,7 @@
                 <w:sz w:val="20"/>
                 <w:szCs w:val="20"/>
               </w:rPr>
-              <w:t>Verificación de RF-06</w:t>
+              <w:t>Especificación y diseño de pruebas de RF-06</w:t>
             </w:r>
           </w:p>
         </w:tc>
@@ -5881,7 +5921,7 @@
                 <w:sz w:val="20"/>
                 <w:szCs w:val="20"/>
               </w:rPr>
-              <w:t>Pruebas de operación en tienda con pedidos simulados y datos reales cargados desde el ERP.</w:t>
+              <w:t>Diseño de interacción del panel de tienda, flujos de preparación de pedidos, cambios de estado y diseño de pruebas.</w:t>
             </w:r>
           </w:p>
         </w:tc>
@@ -5895,18 +5935,28 @@
               <w:spacing w:before="120" w:after="120"/>
               <w:rPr>
                 <w:b/>
-                <w:sz w:val="19"/>
-                <w:szCs w:val="19"/>
-              </w:rPr>
-            </w:pPr>
-            <w:r>
-              <w:rPr>
-                <w:b/>
-                <w:bCs/>
-                <w:sz w:val="20"/>
-                <w:szCs w:val="20"/>
-              </w:rPr>
-              <w:t>1.2.4.3</w:t>
+                <w:bCs/>
+                <w:sz w:val="19"/>
+                <w:szCs w:val="19"/>
+              </w:rPr>
+            </w:pPr>
+            <w:r>
+              <w:rPr>
+                <w:b/>
+                <w:bCs/>
+                <w:sz w:val="20"/>
+                <w:szCs w:val="20"/>
+              </w:rPr>
+              <w:t>1.2.4.</w:t>
+            </w:r>
+            <w:r>
+              <w:rPr>
+                <w:b/>
+                <w:bCs/>
+                <w:sz w:val="20"/>
+                <w:szCs w:val="20"/>
+              </w:rPr>
+              <w:t>3</w:t>
             </w:r>
           </w:p>
         </w:tc>
@@ -5957,7 +6007,7 @@
                 <w:sz w:val="20"/>
                 <w:szCs w:val="20"/>
               </w:rPr>
-              <w:t>V</w:t>
+              <w:t>E</w:t>
             </w:r>
           </w:p>
         </w:tc>
@@ -6012,7 +6062,7 @@
                 <w:sz w:val="20"/>
                 <w:szCs w:val="20"/>
               </w:rPr>
-              <w:t>Especificación y diseño de pruebas de RF-07</w:t>
+              <w:t>Construcción e integración de RF-06</w:t>
             </w:r>
           </w:p>
         </w:tc>
@@ -6035,23 +6085,7 @@
                 <w:sz w:val="20"/>
                 <w:szCs w:val="20"/>
               </w:rPr>
-              <w:t xml:space="preserve">Definición de plantillas y eventos de aviso por email y notificaciones </w:t>
-            </w:r>
-            <w:proofErr w:type="spellStart"/>
-            <w:r>
-              <w:rPr>
-                <w:sz w:val="20"/>
-                <w:szCs w:val="20"/>
-              </w:rPr>
-              <w:t>push</w:t>
-            </w:r>
-            <w:proofErr w:type="spellEnd"/>
-            <w:r>
-              <w:rPr>
-                <w:sz w:val="20"/>
-                <w:szCs w:val="20"/>
-              </w:rPr>
-              <w:t xml:space="preserve"> en iOS/Android y casos de prueba.</w:t>
+              <w:t>Desarrollo de la aplicación web del panel de tienda, servicio de pedidos de tienda y sincronización de estados.</w:t>
             </w:r>
           </w:p>
         </w:tc>
@@ -6065,18 +6099,28 @@
               <w:spacing w:before="120" w:after="120"/>
               <w:rPr>
                 <w:b/>
-                <w:sz w:val="19"/>
-                <w:szCs w:val="19"/>
-              </w:rPr>
-            </w:pPr>
-            <w:r>
-              <w:rPr>
-                <w:b/>
-                <w:bCs/>
-                <w:sz w:val="20"/>
-                <w:szCs w:val="20"/>
-              </w:rPr>
-              <w:t>1.2.5.1</w:t>
+                <w:bCs/>
+                <w:sz w:val="19"/>
+                <w:szCs w:val="19"/>
+              </w:rPr>
+            </w:pPr>
+            <w:r>
+              <w:rPr>
+                <w:b/>
+                <w:bCs/>
+                <w:sz w:val="20"/>
+                <w:szCs w:val="20"/>
+              </w:rPr>
+              <w:t>1.2.</w:t>
+            </w:r>
+            <w:r>
+              <w:rPr>
+                <w:b/>
+                <w:bCs/>
+                <w:sz w:val="20"/>
+                <w:szCs w:val="20"/>
+              </w:rPr>
+              <w:t>5.2</w:t>
             </w:r>
           </w:p>
         </w:tc>
@@ -6102,7 +6146,7 @@
                 <w:sz w:val="20"/>
                 <w:szCs w:val="20"/>
               </w:rPr>
-              <w:t>RF-07</w:t>
+              <w:t>RF-06</w:t>
             </w:r>
           </w:p>
         </w:tc>
@@ -6127,7 +6171,7 @@
                 <w:sz w:val="20"/>
                 <w:szCs w:val="20"/>
               </w:rPr>
-              <w:t>E</w:t>
+              <w:t>C</w:t>
             </w:r>
           </w:p>
         </w:tc>
@@ -6182,7 +6226,7 @@
                 <w:sz w:val="20"/>
                 <w:szCs w:val="20"/>
               </w:rPr>
-              <w:t>Construcción e integración de RF-07</w:t>
+              <w:t>Verificación de RF-06</w:t>
             </w:r>
           </w:p>
         </w:tc>
@@ -6205,23 +6249,7 @@
                 <w:sz w:val="20"/>
                 <w:szCs w:val="20"/>
               </w:rPr>
-              <w:t xml:space="preserve">Implementación del microservicio de notificaciones, pasarela SMTP y conexión con servicios </w:t>
-            </w:r>
-            <w:proofErr w:type="spellStart"/>
-            <w:r>
-              <w:rPr>
-                <w:sz w:val="20"/>
-                <w:szCs w:val="20"/>
-              </w:rPr>
-              <w:t>APNs</w:t>
-            </w:r>
-            <w:proofErr w:type="spellEnd"/>
-            <w:r>
-              <w:rPr>
-                <w:sz w:val="20"/>
-                <w:szCs w:val="20"/>
-              </w:rPr>
-              <w:t xml:space="preserve"> y FCM.</w:t>
+              <w:t>Pruebas de operación en tienda con pedidos simulados y datos reales cargados desde el ERP.</w:t>
             </w:r>
           </w:p>
         </w:tc>
@@ -6235,18 +6263,28 @@
               <w:spacing w:before="120" w:after="120"/>
               <w:rPr>
                 <w:b/>
-                <w:sz w:val="19"/>
-                <w:szCs w:val="19"/>
-              </w:rPr>
-            </w:pPr>
-            <w:r>
-              <w:rPr>
-                <w:b/>
-                <w:bCs/>
-                <w:sz w:val="20"/>
-                <w:szCs w:val="20"/>
-              </w:rPr>
-              <w:t>1.2.5.2</w:t>
+                <w:bCs/>
+                <w:sz w:val="19"/>
+                <w:szCs w:val="19"/>
+              </w:rPr>
+            </w:pPr>
+            <w:r>
+              <w:rPr>
+                <w:b/>
+                <w:bCs/>
+                <w:sz w:val="20"/>
+                <w:szCs w:val="20"/>
+              </w:rPr>
+              <w:t>1.2.</w:t>
+            </w:r>
+            <w:r>
+              <w:rPr>
+                <w:b/>
+                <w:bCs/>
+                <w:sz w:val="20"/>
+                <w:szCs w:val="20"/>
+              </w:rPr>
+              <w:t>5.2</w:t>
             </w:r>
           </w:p>
         </w:tc>
@@ -6272,7 +6310,7 @@
                 <w:sz w:val="20"/>
                 <w:szCs w:val="20"/>
               </w:rPr>
-              <w:t>RF-07</w:t>
+              <w:t>RF-06</w:t>
             </w:r>
           </w:p>
         </w:tc>
@@ -6297,7 +6335,7 @@
                 <w:sz w:val="20"/>
                 <w:szCs w:val="20"/>
               </w:rPr>
-              <w:t>C</w:t>
+              <w:t>V</w:t>
             </w:r>
           </w:p>
         </w:tc>
@@ -6352,7 +6390,7 @@
                 <w:sz w:val="20"/>
                 <w:szCs w:val="20"/>
               </w:rPr>
-              <w:t>Verificación de RF-07</w:t>
+              <w:t>Especificación y diseño de pruebas de RF-07</w:t>
             </w:r>
           </w:p>
         </w:tc>
@@ -6375,7 +6413,7 @@
                 <w:sz w:val="20"/>
                 <w:szCs w:val="20"/>
               </w:rPr>
-              <w:t>Pruebas de envío y recepción de correos y alertas móviles ante cambios de estado de pedidos.</w:t>
+              <w:t>Definición de plantillas y eventos de aviso por email y notificaciones push en iOS/Android y casos de prueba.</w:t>
             </w:r>
           </w:p>
         </w:tc>
@@ -6389,18 +6427,37 @@
               <w:spacing w:before="120" w:after="120"/>
               <w:rPr>
                 <w:b/>
-                <w:sz w:val="19"/>
-                <w:szCs w:val="19"/>
-              </w:rPr>
-            </w:pPr>
-            <w:r>
-              <w:rPr>
-                <w:b/>
-                <w:bCs/>
-                <w:sz w:val="20"/>
-                <w:szCs w:val="20"/>
-              </w:rPr>
-              <w:t>1.2.5.3</w:t>
+                <w:bCs/>
+                <w:sz w:val="19"/>
+                <w:szCs w:val="19"/>
+              </w:rPr>
+            </w:pPr>
+            <w:r>
+              <w:rPr>
+                <w:b/>
+                <w:bCs/>
+                <w:sz w:val="20"/>
+                <w:szCs w:val="20"/>
+              </w:rPr>
+              <w:t>1.2.</w:t>
+            </w:r>
+            <w:r>
+              <w:rPr>
+                <w:b/>
+                <w:bCs/>
+                <w:sz w:val="20"/>
+                <w:szCs w:val="20"/>
+              </w:rPr>
+              <w:t>6</w:t>
+            </w:r>
+            <w:r>
+              <w:rPr>
+                <w:b/>
+                <w:bCs/>
+                <w:sz w:val="20"/>
+                <w:szCs w:val="20"/>
+              </w:rPr>
+              <w:t>.1</w:t>
             </w:r>
           </w:p>
         </w:tc>
@@ -6451,7 +6508,7 @@
                 <w:sz w:val="20"/>
                 <w:szCs w:val="20"/>
               </w:rPr>
-              <w:t>V</w:t>
+              <w:t>E</w:t>
             </w:r>
           </w:p>
         </w:tc>
@@ -6506,7 +6563,7 @@
                 <w:sz w:val="20"/>
                 <w:szCs w:val="20"/>
               </w:rPr>
-              <w:t>Especificación y diseño de pruebas de RF-08</w:t>
+              <w:t>Construcción e integración de RF-07</w:t>
             </w:r>
           </w:p>
         </w:tc>
@@ -6529,7 +6586,7 @@
                 <w:sz w:val="20"/>
                 <w:szCs w:val="20"/>
               </w:rPr>
-              <w:t>Definición de los cuatro informes de ventas por periodo comercial (CA-01), formatos agregados y pruebas.</w:t>
+              <w:t>Implementación del microservicio de notificaciones, pasarela SMTP y conexión con servicios APNs y FCM.</w:t>
             </w:r>
           </w:p>
         </w:tc>
@@ -6543,18 +6600,46 @@
               <w:spacing w:before="120" w:after="120"/>
               <w:rPr>
                 <w:b/>
-                <w:sz w:val="19"/>
-                <w:szCs w:val="19"/>
-              </w:rPr>
-            </w:pPr>
-            <w:r>
-              <w:rPr>
-                <w:b/>
-                <w:bCs/>
-                <w:sz w:val="20"/>
-                <w:szCs w:val="20"/>
-              </w:rPr>
-              <w:t>1.2.5.1</w:t>
+                <w:bCs/>
+                <w:sz w:val="19"/>
+                <w:szCs w:val="19"/>
+              </w:rPr>
+            </w:pPr>
+            <w:r>
+              <w:rPr>
+                <w:b/>
+                <w:bCs/>
+                <w:sz w:val="20"/>
+                <w:szCs w:val="20"/>
+              </w:rPr>
+              <w:t>1.2.</w:t>
+            </w:r>
+            <w:r>
+              <w:rPr>
+                <w:b/>
+                <w:bCs/>
+                <w:sz w:val="20"/>
+                <w:szCs w:val="20"/>
+              </w:rPr>
+              <w:t>6</w:t>
+            </w:r>
+            <w:r>
+              <w:rPr>
+                <w:b/>
+                <w:bCs/>
+                <w:sz w:val="20"/>
+                <w:szCs w:val="20"/>
+              </w:rPr>
+              <w:t>.</w:t>
+            </w:r>
+            <w:r>
+              <w:rPr>
+                <w:b/>
+                <w:bCs/>
+                <w:sz w:val="20"/>
+                <w:szCs w:val="20"/>
+              </w:rPr>
+              <w:t>1</w:t>
             </w:r>
           </w:p>
         </w:tc>
@@ -6580,7 +6665,7 @@
                 <w:sz w:val="20"/>
                 <w:szCs w:val="20"/>
               </w:rPr>
-              <w:t>RF-08</w:t>
+              <w:t>RF-07</w:t>
             </w:r>
           </w:p>
         </w:tc>
@@ -6605,7 +6690,7 @@
                 <w:sz w:val="20"/>
                 <w:szCs w:val="20"/>
               </w:rPr>
-              <w:t>E</w:t>
+              <w:t>C</w:t>
             </w:r>
           </w:p>
         </w:tc>
@@ -6660,7 +6745,7 @@
                 <w:sz w:val="20"/>
                 <w:szCs w:val="20"/>
               </w:rPr>
-              <w:t>Construcción e integración de RF-08</w:t>
+              <w:t>Verificación de RF-07</w:t>
             </w:r>
           </w:p>
         </w:tc>
@@ -6683,7 +6768,7 @@
                 <w:sz w:val="20"/>
                 <w:szCs w:val="20"/>
               </w:rPr>
-              <w:t>Desarrollo del servicio de informes, agregación de ventas diarias, productos más vendidos y módulo web de dirección.</w:t>
+              <w:t>Pruebas de envío y recepción de correos y alertas móviles ante cambios de estado de pedidos.</w:t>
             </w:r>
           </w:p>
         </w:tc>
@@ -6697,18 +6782,28 @@
               <w:spacing w:before="120" w:after="120"/>
               <w:rPr>
                 <w:b/>
-                <w:sz w:val="19"/>
-                <w:szCs w:val="19"/>
-              </w:rPr>
-            </w:pPr>
-            <w:r>
-              <w:rPr>
-                <w:b/>
-                <w:bCs/>
-                <w:sz w:val="20"/>
-                <w:szCs w:val="20"/>
-              </w:rPr>
-              <w:t>1.2.5.2</w:t>
+                <w:bCs/>
+                <w:sz w:val="19"/>
+                <w:szCs w:val="19"/>
+              </w:rPr>
+            </w:pPr>
+            <w:r>
+              <w:rPr>
+                <w:b/>
+                <w:bCs/>
+                <w:sz w:val="20"/>
+                <w:szCs w:val="20"/>
+              </w:rPr>
+              <w:t>1.2.</w:t>
+            </w:r>
+            <w:r>
+              <w:rPr>
+                <w:b/>
+                <w:bCs/>
+                <w:sz w:val="20"/>
+                <w:szCs w:val="20"/>
+              </w:rPr>
+              <w:t>6.1</w:t>
             </w:r>
           </w:p>
         </w:tc>
@@ -6734,7 +6829,7 @@
                 <w:sz w:val="20"/>
                 <w:szCs w:val="20"/>
               </w:rPr>
-              <w:t>RF-08</w:t>
+              <w:t>RF-07</w:t>
             </w:r>
           </w:p>
         </w:tc>
@@ -6759,7 +6854,7 @@
                 <w:sz w:val="20"/>
                 <w:szCs w:val="20"/>
               </w:rPr>
-              <w:t>C</w:t>
+              <w:t>V</w:t>
             </w:r>
           </w:p>
         </w:tc>
@@ -6814,7 +6909,7 @@
                 <w:sz w:val="20"/>
                 <w:szCs w:val="20"/>
               </w:rPr>
-              <w:t>Verificación de RF-08</w:t>
+              <w:t>Especificación y diseño de pruebas de RF-08</w:t>
             </w:r>
           </w:p>
         </w:tc>
@@ -6837,7 +6932,7 @@
                 <w:sz w:val="20"/>
                 <w:szCs w:val="20"/>
               </w:rPr>
-              <w:t>Comprobación de cuadre de cifras contra ventas registradas y agregación por periodos comerciales.</w:t>
+              <w:t>Definición de los cuatro informes de ventas por periodo comercial (CA-01), formatos agregados y pruebas.</w:t>
             </w:r>
           </w:p>
         </w:tc>
@@ -6851,18 +6946,28 @@
               <w:spacing w:before="120" w:after="120"/>
               <w:rPr>
                 <w:b/>
-                <w:sz w:val="19"/>
-                <w:szCs w:val="19"/>
-              </w:rPr>
-            </w:pPr>
-            <w:r>
-              <w:rPr>
-                <w:b/>
-                <w:bCs/>
-                <w:sz w:val="20"/>
-                <w:szCs w:val="20"/>
-              </w:rPr>
-              <w:t>1.2.5.3</w:t>
+                <w:bCs/>
+                <w:sz w:val="19"/>
+                <w:szCs w:val="19"/>
+              </w:rPr>
+            </w:pPr>
+            <w:r>
+              <w:rPr>
+                <w:b/>
+                <w:bCs/>
+                <w:sz w:val="20"/>
+                <w:szCs w:val="20"/>
+              </w:rPr>
+              <w:t>1.2.</w:t>
+            </w:r>
+            <w:r>
+              <w:rPr>
+                <w:b/>
+                <w:bCs/>
+                <w:sz w:val="20"/>
+                <w:szCs w:val="20"/>
+              </w:rPr>
+              <w:t>6.2</w:t>
             </w:r>
           </w:p>
         </w:tc>
@@ -6913,7 +7018,7 @@
                 <w:sz w:val="20"/>
                 <w:szCs w:val="20"/>
               </w:rPr>
-              <w:t>V</w:t>
+              <w:t>E</w:t>
             </w:r>
           </w:p>
         </w:tc>
@@ -6968,7 +7073,7 @@
                 <w:sz w:val="20"/>
                 <w:szCs w:val="20"/>
               </w:rPr>
-              <w:t>Arquitectura y entorno de integración</w:t>
+              <w:t>Construcción e integración de RF-08</w:t>
             </w:r>
           </w:p>
         </w:tc>
@@ -6991,7 +7096,7 @@
                 <w:sz w:val="20"/>
                 <w:szCs w:val="20"/>
               </w:rPr>
-              <w:t>Configuración de repositorio Git, canalización CI/CD con pruebas automatizadas y entorno de desarrollo.</w:t>
+              <w:t>Desarrollo del servicio de informes, agregación de ventas diarias, productos más vendidos y módulo web de dirección.</w:t>
             </w:r>
           </w:p>
         </w:tc>
@@ -7005,18 +7110,28 @@
               <w:spacing w:before="120" w:after="120"/>
               <w:rPr>
                 <w:b/>
-                <w:sz w:val="19"/>
-                <w:szCs w:val="19"/>
-              </w:rPr>
-            </w:pPr>
-            <w:r>
-              <w:rPr>
-                <w:b/>
-                <w:bCs/>
-                <w:sz w:val="20"/>
-                <w:szCs w:val="20"/>
-              </w:rPr>
-              <w:t>1.3.1.1</w:t>
+                <w:bCs/>
+                <w:sz w:val="19"/>
+                <w:szCs w:val="19"/>
+              </w:rPr>
+            </w:pPr>
+            <w:r>
+              <w:rPr>
+                <w:b/>
+                <w:bCs/>
+                <w:sz w:val="20"/>
+                <w:szCs w:val="20"/>
+              </w:rPr>
+              <w:t>1.2.</w:t>
+            </w:r>
+            <w:r>
+              <w:rPr>
+                <w:b/>
+                <w:bCs/>
+                <w:sz w:val="20"/>
+                <w:szCs w:val="20"/>
+              </w:rPr>
+              <w:t>6.2</w:t>
             </w:r>
           </w:p>
         </w:tc>
@@ -7038,11 +7153,11 @@
               <w:rPr>
                 <w:b/>
                 <w:bCs/>
-                <w:color w:val="548235"/>
-                <w:sz w:val="20"/>
-                <w:szCs w:val="20"/>
-              </w:rPr>
-              <w:t>EP-03</w:t>
+                <w:color w:val="1F497D"/>
+                <w:sz w:val="20"/>
+                <w:szCs w:val="20"/>
+              </w:rPr>
+              <w:t>RF-08</w:t>
             </w:r>
           </w:p>
         </w:tc>
@@ -7067,7 +7182,7 @@
                 <w:sz w:val="20"/>
                 <w:szCs w:val="20"/>
               </w:rPr>
-              <w:t>—</w:t>
+              <w:t>C</w:t>
             </w:r>
           </w:p>
         </w:tc>
@@ -7122,7 +7237,7 @@
                 <w:sz w:val="20"/>
                 <w:szCs w:val="20"/>
               </w:rPr>
-              <w:t>Especificación de interfaz con conector</w:t>
+              <w:t>Verificación de RF-08</w:t>
             </w:r>
           </w:p>
         </w:tc>
@@ -7145,23 +7260,7 @@
                 <w:sz w:val="20"/>
                 <w:szCs w:val="20"/>
               </w:rPr>
-              <w:t xml:space="preserve">Redacción y acuerdo del contrato de interfaz técnica </w:t>
-            </w:r>
-            <w:proofErr w:type="spellStart"/>
-            <w:r>
-              <w:rPr>
-                <w:sz w:val="20"/>
-                <w:szCs w:val="20"/>
-              </w:rPr>
-              <w:t>OpenAPI</w:t>
-            </w:r>
-            <w:proofErr w:type="spellEnd"/>
-            <w:r>
-              <w:rPr>
-                <w:sz w:val="20"/>
-                <w:szCs w:val="20"/>
-              </w:rPr>
-              <w:t xml:space="preserve"> con el conector del ERP (ESP, DA-03).</w:t>
+              <w:t>Comprobación de cuadre de cifras contra ventas registradas y agregación por periodos comerciales.</w:t>
             </w:r>
           </w:p>
         </w:tc>
@@ -7175,18 +7274,28 @@
               <w:spacing w:before="120" w:after="120"/>
               <w:rPr>
                 <w:b/>
-                <w:sz w:val="19"/>
-                <w:szCs w:val="19"/>
-              </w:rPr>
-            </w:pPr>
-            <w:r>
-              <w:rPr>
-                <w:b/>
-                <w:bCs/>
-                <w:sz w:val="20"/>
-                <w:szCs w:val="20"/>
-              </w:rPr>
-              <w:t>1.3.1.2</w:t>
+                <w:bCs/>
+                <w:sz w:val="19"/>
+                <w:szCs w:val="19"/>
+              </w:rPr>
+            </w:pPr>
+            <w:r>
+              <w:rPr>
+                <w:b/>
+                <w:bCs/>
+                <w:sz w:val="20"/>
+                <w:szCs w:val="20"/>
+              </w:rPr>
+              <w:t>1.2.</w:t>
+            </w:r>
+            <w:r>
+              <w:rPr>
+                <w:b/>
+                <w:bCs/>
+                <w:sz w:val="20"/>
+                <w:szCs w:val="20"/>
+              </w:rPr>
+              <w:t>6.2</w:t>
             </w:r>
           </w:p>
         </w:tc>
@@ -7208,11 +7317,11 @@
               <w:rPr>
                 <w:b/>
                 <w:bCs/>
-                <w:color w:val="548235"/>
-                <w:sz w:val="20"/>
-                <w:szCs w:val="20"/>
-              </w:rPr>
-              <w:t>EP-04</w:t>
+                <w:color w:val="1F497D"/>
+                <w:sz w:val="20"/>
+                <w:szCs w:val="20"/>
+              </w:rPr>
+              <w:t>RF-08</w:t>
             </w:r>
           </w:p>
         </w:tc>
@@ -7237,7 +7346,7 @@
                 <w:sz w:val="20"/>
                 <w:szCs w:val="20"/>
               </w:rPr>
-              <w:t>—</w:t>
+              <w:t>V</w:t>
             </w:r>
           </w:p>
         </w:tc>
@@ -7292,7 +7401,7 @@
                 <w:sz w:val="20"/>
                 <w:szCs w:val="20"/>
               </w:rPr>
-              <w:t>Construcción de capa de adaptación al ERP</w:t>
+              <w:t>Arquitectura y entorno de integración</w:t>
             </w:r>
           </w:p>
         </w:tc>
@@ -7315,7 +7424,7 @@
                 <w:sz w:val="20"/>
                 <w:szCs w:val="20"/>
               </w:rPr>
-              <w:t>Programación de los módulos de sincronización de catálogo, precios, existencias y volcado de pedidos (ADP).</w:t>
+              <w:t>Configuración de repositorio Git, canalización CI/CD con pruebas automatizadas y entorno de desarrollo.</w:t>
             </w:r>
           </w:p>
         </w:tc>
@@ -7329,18 +7438,28 @@
               <w:spacing w:before="120" w:after="120"/>
               <w:rPr>
                 <w:b/>
-                <w:sz w:val="19"/>
-                <w:szCs w:val="19"/>
-              </w:rPr>
-            </w:pPr>
-            <w:r>
-              <w:rPr>
-                <w:b/>
-                <w:bCs/>
-                <w:sz w:val="20"/>
-                <w:szCs w:val="20"/>
-              </w:rPr>
-              <w:t>1.3.2.1</w:t>
+                <w:bCs/>
+                <w:sz w:val="19"/>
+                <w:szCs w:val="19"/>
+              </w:rPr>
+            </w:pPr>
+            <w:r>
+              <w:rPr>
+                <w:b/>
+                <w:bCs/>
+                <w:sz w:val="20"/>
+                <w:szCs w:val="20"/>
+              </w:rPr>
+              <w:t>1.</w:t>
+            </w:r>
+            <w:r>
+              <w:rPr>
+                <w:b/>
+                <w:bCs/>
+                <w:sz w:val="20"/>
+                <w:szCs w:val="20"/>
+              </w:rPr>
+              <w:t>2.1.2</w:t>
             </w:r>
           </w:p>
         </w:tc>
@@ -7366,7 +7485,7 @@
                 <w:sz w:val="20"/>
                 <w:szCs w:val="20"/>
               </w:rPr>
-              <w:t>EP-04</w:t>
+              <w:t>EP-03</w:t>
             </w:r>
           </w:p>
         </w:tc>
@@ -7446,7 +7565,7 @@
                 <w:sz w:val="20"/>
                 <w:szCs w:val="20"/>
               </w:rPr>
-              <w:t>Pruebas de integración con ERP heredado</w:t>
+              <w:t>Especificación de interfaz con conector</w:t>
             </w:r>
           </w:p>
         </w:tc>
@@ -7469,7 +7588,7 @@
                 <w:sz w:val="20"/>
                 <w:szCs w:val="20"/>
               </w:rPr>
-              <w:t>Ensayos de sincronización extremo a extremo con el ERP a través del conector en verificación (PRI).</w:t>
+              <w:t>Redacción y acuerdo del contrato de interfaz técnica OpenAPI con el conector del ERP (ESP, DA-03).</w:t>
             </w:r>
           </w:p>
         </w:tc>
@@ -7483,18 +7602,28 @@
               <w:spacing w:before="120" w:after="120"/>
               <w:rPr>
                 <w:b/>
-                <w:sz w:val="19"/>
-                <w:szCs w:val="19"/>
-              </w:rPr>
-            </w:pPr>
-            <w:r>
-              <w:rPr>
-                <w:b/>
-                <w:bCs/>
-                <w:sz w:val="20"/>
-                <w:szCs w:val="20"/>
-              </w:rPr>
-              <w:t>1.3.3.1</w:t>
+                <w:bCs/>
+                <w:sz w:val="19"/>
+                <w:szCs w:val="19"/>
+              </w:rPr>
+            </w:pPr>
+            <w:r>
+              <w:rPr>
+                <w:b/>
+                <w:bCs/>
+                <w:sz w:val="20"/>
+                <w:szCs w:val="20"/>
+              </w:rPr>
+              <w:t>1.3.</w:t>
+            </w:r>
+            <w:r>
+              <w:rPr>
+                <w:b/>
+                <w:bCs/>
+                <w:sz w:val="20"/>
+                <w:szCs w:val="20"/>
+              </w:rPr>
+              <w:t>1.1</w:t>
             </w:r>
           </w:p>
         </w:tc>
@@ -7577,7 +7706,6 @@
                 <w:sz w:val="20"/>
                 <w:szCs w:val="20"/>
               </w:rPr>
-              <w:lastRenderedPageBreak/>
               <w:t>ACT-40</w:t>
             </w:r>
           </w:p>
@@ -7601,7 +7729,7 @@
                 <w:sz w:val="20"/>
                 <w:szCs w:val="20"/>
               </w:rPr>
-              <w:t>Carga inicial de datos en verificación</w:t>
+              <w:t>Construcción de capa de adaptación al ERP</w:t>
             </w:r>
           </w:p>
         </w:tc>
@@ -7624,7 +7752,7 @@
                 <w:sz w:val="20"/>
                 <w:szCs w:val="20"/>
               </w:rPr>
-              <w:t>Carga masiva de existencias, precios y referencias de las 32 tiendas en el entorno de verificación (CAR).</w:t>
+              <w:t>Programación de los módulos de sincronización de catálogo, precios, existencias y volcado de pedidos (ADP).</w:t>
             </w:r>
           </w:p>
         </w:tc>
@@ -7638,18 +7766,28 @@
               <w:spacing w:before="120" w:after="120"/>
               <w:rPr>
                 <w:b/>
-                <w:sz w:val="19"/>
-                <w:szCs w:val="19"/>
-              </w:rPr>
-            </w:pPr>
-            <w:r>
-              <w:rPr>
-                <w:b/>
-                <w:bCs/>
-                <w:sz w:val="20"/>
-                <w:szCs w:val="20"/>
-              </w:rPr>
-              <w:t>1.3.3.2</w:t>
+                <w:bCs/>
+                <w:sz w:val="19"/>
+                <w:szCs w:val="19"/>
+              </w:rPr>
+            </w:pPr>
+            <w:r>
+              <w:rPr>
+                <w:b/>
+                <w:bCs/>
+                <w:sz w:val="20"/>
+                <w:szCs w:val="20"/>
+              </w:rPr>
+              <w:t>1.3.</w:t>
+            </w:r>
+            <w:r>
+              <w:rPr>
+                <w:b/>
+                <w:bCs/>
+                <w:sz w:val="20"/>
+                <w:szCs w:val="20"/>
+              </w:rPr>
+              <w:t>1.1</w:t>
             </w:r>
           </w:p>
         </w:tc>
@@ -7755,7 +7893,7 @@
                 <w:sz w:val="20"/>
                 <w:szCs w:val="20"/>
               </w:rPr>
-              <w:t>Solicitud y validación de recarga de datos</w:t>
+              <w:t>Pruebas de integración con ERP heredado</w:t>
             </w:r>
           </w:p>
         </w:tc>
@@ -7778,7 +7916,7 @@
                 <w:sz w:val="20"/>
                 <w:szCs w:val="20"/>
               </w:rPr>
-              <w:t>Petición formal a Sistemas de TI de recarga de datos y comprobación de integridad (CVE, RT-02).</w:t>
+              <w:t>Ensayos de sincronización extremo a extremo con el ERP a través del conector en verificación (PRI).</w:t>
             </w:r>
           </w:p>
         </w:tc>
@@ -7792,18 +7930,28 @@
               <w:spacing w:before="120" w:after="120"/>
               <w:rPr>
                 <w:b/>
-                <w:sz w:val="19"/>
-                <w:szCs w:val="19"/>
-              </w:rPr>
-            </w:pPr>
-            <w:r>
-              <w:rPr>
-                <w:b/>
-                <w:bCs/>
-                <w:sz w:val="20"/>
-                <w:szCs w:val="20"/>
-              </w:rPr>
-              <w:t>1.3.3.3</w:t>
+                <w:bCs/>
+                <w:sz w:val="19"/>
+                <w:szCs w:val="19"/>
+              </w:rPr>
+            </w:pPr>
+            <w:r>
+              <w:rPr>
+                <w:b/>
+                <w:bCs/>
+                <w:sz w:val="20"/>
+                <w:szCs w:val="20"/>
+              </w:rPr>
+              <w:t>1.3.</w:t>
+            </w:r>
+            <w:r>
+              <w:rPr>
+                <w:b/>
+                <w:bCs/>
+                <w:sz w:val="20"/>
+                <w:szCs w:val="20"/>
+              </w:rPr>
+              <w:t>2.2</w:t>
             </w:r>
           </w:p>
         </w:tc>
@@ -7909,7 +8057,7 @@
                 <w:sz w:val="20"/>
                 <w:szCs w:val="20"/>
               </w:rPr>
-              <w:t>Pruebas de carga y rendimiento</w:t>
+              <w:t>Carga inicial de datos en verificación</w:t>
             </w:r>
           </w:p>
         </w:tc>
@@ -7932,7 +8080,7 @@
                 <w:sz w:val="20"/>
                 <w:szCs w:val="20"/>
               </w:rPr>
-              <w:t>Ensayos en preproducción simulando 2.000 usuarios concurrentes y tiempos de respuesta &lt; 2 s (PCA, RNF-01).</w:t>
+              <w:t>Carga masiva de existencias, precios y referencias de las 32 tiendas en el entorno de verificación (CAR).</w:t>
             </w:r>
           </w:p>
         </w:tc>
@@ -7946,18 +8094,28 @@
               <w:spacing w:before="120" w:after="120"/>
               <w:rPr>
                 <w:b/>
-                <w:sz w:val="19"/>
-                <w:szCs w:val="19"/>
-              </w:rPr>
-            </w:pPr>
-            <w:r>
-              <w:rPr>
-                <w:b/>
-                <w:bCs/>
-                <w:sz w:val="20"/>
-                <w:szCs w:val="20"/>
-              </w:rPr>
-              <w:t>1.4.1.1</w:t>
+                <w:bCs/>
+                <w:sz w:val="19"/>
+                <w:szCs w:val="19"/>
+              </w:rPr>
+            </w:pPr>
+            <w:r>
+              <w:rPr>
+                <w:b/>
+                <w:bCs/>
+                <w:sz w:val="20"/>
+                <w:szCs w:val="20"/>
+              </w:rPr>
+              <w:t>1.3.</w:t>
+            </w:r>
+            <w:r>
+              <w:rPr>
+                <w:b/>
+                <w:bCs/>
+                <w:sz w:val="20"/>
+                <w:szCs w:val="20"/>
+              </w:rPr>
+              <w:t>2.1</w:t>
             </w:r>
           </w:p>
         </w:tc>
@@ -7983,7 +8141,7 @@
                 <w:sz w:val="20"/>
                 <w:szCs w:val="20"/>
               </w:rPr>
-              <w:t>EP-05</w:t>
+              <w:t>EP-04</w:t>
             </w:r>
           </w:p>
         </w:tc>
@@ -8063,7 +8221,7 @@
                 <w:sz w:val="20"/>
                 <w:szCs w:val="20"/>
               </w:rPr>
-              <w:t>Pruebas de seguridad de la plataforma</w:t>
+              <w:t>Solicitud y validación de recarga de datos</w:t>
             </w:r>
           </w:p>
         </w:tc>
@@ -8086,7 +8244,7 @@
                 <w:sz w:val="20"/>
                 <w:szCs w:val="20"/>
               </w:rPr>
-              <w:t>Auditoría de vulnerabilidades, cifrado de comunicaciones y protección de datos (PSE, RNF-03).</w:t>
+              <w:t>Petición formal a Sistemas de TI de recarga de datos y comprobación de integridad (CVE, RT-02).</w:t>
             </w:r>
           </w:p>
         </w:tc>
@@ -8100,18 +8258,28 @@
               <w:spacing w:before="120" w:after="120"/>
               <w:rPr>
                 <w:b/>
-                <w:sz w:val="19"/>
-                <w:szCs w:val="19"/>
-              </w:rPr>
-            </w:pPr>
-            <w:r>
-              <w:rPr>
-                <w:b/>
-                <w:bCs/>
-                <w:sz w:val="20"/>
-                <w:szCs w:val="20"/>
-              </w:rPr>
-              <w:t>1.4.1.1</w:t>
+                <w:bCs/>
+                <w:sz w:val="19"/>
+                <w:szCs w:val="19"/>
+              </w:rPr>
+            </w:pPr>
+            <w:r>
+              <w:rPr>
+                <w:b/>
+                <w:bCs/>
+                <w:sz w:val="20"/>
+                <w:szCs w:val="20"/>
+              </w:rPr>
+              <w:t>1.3.</w:t>
+            </w:r>
+            <w:r>
+              <w:rPr>
+                <w:b/>
+                <w:bCs/>
+                <w:sz w:val="20"/>
+                <w:szCs w:val="20"/>
+              </w:rPr>
+              <w:t>2.1</w:t>
             </w:r>
           </w:p>
         </w:tc>
@@ -8137,7 +8305,7 @@
                 <w:sz w:val="20"/>
                 <w:szCs w:val="20"/>
               </w:rPr>
-              <w:t>EP-05</w:t>
+              <w:t>EP-04</w:t>
             </w:r>
           </w:p>
         </w:tc>
@@ -8217,7 +8385,7 @@
                 <w:sz w:val="20"/>
                 <w:szCs w:val="20"/>
               </w:rPr>
-              <w:t>Auditoría de pasarela de pago</w:t>
+              <w:t>Pruebas de carga y rendimiento</w:t>
             </w:r>
           </w:p>
         </w:tc>
@@ -8240,7 +8408,7 @@
                 <w:sz w:val="20"/>
                 <w:szCs w:val="20"/>
               </w:rPr>
-              <w:t>Gestión y superación de la auditoría técnica de 15 días hábiles del banco para credenciales reales (AUD).</w:t>
+              <w:t>Ensayos en preproducción simulando 2.000 usuarios concurrentes y tiempos de respuesta &lt; 2 s (PCA, RNF-01).</w:t>
             </w:r>
           </w:p>
         </w:tc>
@@ -8254,18 +8422,19 @@
               <w:spacing w:before="120" w:after="120"/>
               <w:rPr>
                 <w:b/>
-                <w:sz w:val="19"/>
-                <w:szCs w:val="19"/>
-              </w:rPr>
-            </w:pPr>
-            <w:r>
-              <w:rPr>
-                <w:b/>
-                <w:bCs/>
-                <w:sz w:val="20"/>
-                <w:szCs w:val="20"/>
-              </w:rPr>
-              <w:t>1.4.1.2</w:t>
+                <w:bCs/>
+                <w:sz w:val="19"/>
+                <w:szCs w:val="19"/>
+              </w:rPr>
+            </w:pPr>
+            <w:r>
+              <w:rPr>
+                <w:b/>
+                <w:bCs/>
+                <w:sz w:val="20"/>
+                <w:szCs w:val="20"/>
+              </w:rPr>
+              <w:t>1.2.7.1</w:t>
             </w:r>
           </w:p>
         </w:tc>
@@ -8285,10 +8454,13 @@
             </w:pPr>
             <w:r>
               <w:rPr>
-                <w:sz w:val="20"/>
-                <w:szCs w:val="20"/>
-              </w:rPr>
-              <w:t>—</w:t>
+                <w:b/>
+                <w:bCs/>
+                <w:color w:val="548235"/>
+                <w:sz w:val="20"/>
+                <w:szCs w:val="20"/>
+              </w:rPr>
+              <w:t>EP-05</w:t>
             </w:r>
           </w:p>
         </w:tc>
@@ -8368,7 +8540,7 @@
                 <w:sz w:val="20"/>
                 <w:szCs w:val="20"/>
               </w:rPr>
-              <w:t>Montaje y configuración de producción</w:t>
+              <w:t>Pruebas de seguridad de la plataforma</w:t>
             </w:r>
           </w:p>
         </w:tc>
@@ -8391,7 +8563,7 @@
                 <w:sz w:val="20"/>
                 <w:szCs w:val="20"/>
               </w:rPr>
-              <w:t>Despliegue de infraestructura, aprovisionamiento de contenedores y configuración de entornos (EP-06).</w:t>
+              <w:t>Auditoría de vulnerabilidades, cifrado de comunicaciones y protección de datos (PSE, RNF-03).</w:t>
             </w:r>
           </w:p>
         </w:tc>
@@ -8405,18 +8577,28 @@
               <w:spacing w:before="120" w:after="120"/>
               <w:rPr>
                 <w:b/>
-                <w:sz w:val="19"/>
-                <w:szCs w:val="19"/>
-              </w:rPr>
-            </w:pPr>
-            <w:r>
-              <w:rPr>
-                <w:b/>
-                <w:bCs/>
-                <w:sz w:val="20"/>
-                <w:szCs w:val="20"/>
-              </w:rPr>
-              <w:t>1.4.2.1</w:t>
+                <w:bCs/>
+                <w:sz w:val="19"/>
+                <w:szCs w:val="19"/>
+              </w:rPr>
+            </w:pPr>
+            <w:r>
+              <w:rPr>
+                <w:b/>
+                <w:bCs/>
+                <w:sz w:val="20"/>
+                <w:szCs w:val="20"/>
+              </w:rPr>
+              <w:t>1</w:t>
+            </w:r>
+            <w:r>
+              <w:rPr>
+                <w:b/>
+                <w:bCs/>
+                <w:sz w:val="20"/>
+                <w:szCs w:val="20"/>
+              </w:rPr>
+              <w:t>.2.7.1</w:t>
             </w:r>
           </w:p>
         </w:tc>
@@ -8442,7 +8624,7 @@
                 <w:sz w:val="20"/>
                 <w:szCs w:val="20"/>
               </w:rPr>
-              <w:t>EP-06</w:t>
+              <w:t>EP-05</w:t>
             </w:r>
           </w:p>
         </w:tc>
@@ -8522,7 +8704,7 @@
                 <w:sz w:val="20"/>
                 <w:szCs w:val="20"/>
               </w:rPr>
-              <w:t>Despliegue para tiendas piloto</w:t>
+              <w:t>Auditoría de pasarela de pago</w:t>
             </w:r>
           </w:p>
         </w:tc>
@@ -8545,23 +8727,7 @@
                 <w:sz w:val="20"/>
                 <w:szCs w:val="20"/>
               </w:rPr>
-              <w:t xml:space="preserve">Puesta en producción restringida de la plataforma para las 3 tiendas designadas por </w:t>
-            </w:r>
-            <w:proofErr w:type="spellStart"/>
-            <w:r>
-              <w:rPr>
-                <w:sz w:val="20"/>
-                <w:szCs w:val="20"/>
-              </w:rPr>
-              <w:t>TuSuper</w:t>
-            </w:r>
-            <w:proofErr w:type="spellEnd"/>
-            <w:r>
-              <w:rPr>
-                <w:sz w:val="20"/>
-                <w:szCs w:val="20"/>
-              </w:rPr>
-              <w:t xml:space="preserve"> (DPI).</w:t>
+              <w:t>Gestión y superación de la auditoría técnica de 15 días hábiles del banco para credenciales reales (AUD).</w:t>
             </w:r>
           </w:p>
         </w:tc>
@@ -8575,18 +8741,28 @@
               <w:spacing w:before="120" w:after="120"/>
               <w:rPr>
                 <w:b/>
-                <w:sz w:val="19"/>
-                <w:szCs w:val="19"/>
-              </w:rPr>
-            </w:pPr>
-            <w:r>
-              <w:rPr>
-                <w:b/>
-                <w:bCs/>
-                <w:sz w:val="20"/>
-                <w:szCs w:val="20"/>
-              </w:rPr>
-              <w:t>1.4.2.2</w:t>
+                <w:bCs/>
+                <w:sz w:val="19"/>
+                <w:szCs w:val="19"/>
+              </w:rPr>
+            </w:pPr>
+            <w:r>
+              <w:rPr>
+                <w:b/>
+                <w:bCs/>
+                <w:sz w:val="20"/>
+                <w:szCs w:val="20"/>
+              </w:rPr>
+              <w:t>1.4.</w:t>
+            </w:r>
+            <w:r>
+              <w:rPr>
+                <w:b/>
+                <w:bCs/>
+                <w:sz w:val="20"/>
+                <w:szCs w:val="20"/>
+              </w:rPr>
+              <w:t>1</w:t>
             </w:r>
           </w:p>
         </w:tc>
@@ -8606,13 +8782,10 @@
             </w:pPr>
             <w:r>
               <w:rPr>
-                <w:b/>
-                <w:bCs/>
-                <w:color w:val="548235"/>
-                <w:sz w:val="20"/>
-                <w:szCs w:val="20"/>
-              </w:rPr>
-              <w:t>EP-06</w:t>
+                <w:sz w:val="20"/>
+                <w:szCs w:val="20"/>
+              </w:rPr>
+              <w:t>—</w:t>
             </w:r>
           </w:p>
         </w:tc>
@@ -8692,7 +8865,7 @@
                 <w:sz w:val="20"/>
                 <w:szCs w:val="20"/>
               </w:rPr>
-              <w:t>Carga inicial de datos en producción</w:t>
+              <w:t>Montaje y configuración de producción</w:t>
             </w:r>
           </w:p>
         </w:tc>
@@ -8715,7 +8888,7 @@
                 <w:sz w:val="20"/>
                 <w:szCs w:val="20"/>
               </w:rPr>
-              <w:t>Carga de catálogo real y existencias vivas de las 3 tiendas piloto previo al arranque (CAR).</w:t>
+              <w:t>Despliegue de infraestructura, aprovisionamiento de contenedores y configuración de entornos (EP-06).</w:t>
             </w:r>
           </w:p>
         </w:tc>
@@ -8729,18 +8902,28 @@
               <w:spacing w:before="120" w:after="120"/>
               <w:rPr>
                 <w:b/>
-                <w:sz w:val="19"/>
-                <w:szCs w:val="19"/>
-              </w:rPr>
-            </w:pPr>
-            <w:r>
-              <w:rPr>
-                <w:b/>
-                <w:bCs/>
-                <w:sz w:val="20"/>
-                <w:szCs w:val="20"/>
-              </w:rPr>
-              <w:t>1.4.2.3</w:t>
+                <w:bCs/>
+                <w:sz w:val="19"/>
+                <w:szCs w:val="19"/>
+              </w:rPr>
+            </w:pPr>
+            <w:r>
+              <w:rPr>
+                <w:b/>
+                <w:bCs/>
+                <w:sz w:val="20"/>
+                <w:szCs w:val="20"/>
+              </w:rPr>
+              <w:t>1.4.</w:t>
+            </w:r>
+            <w:r>
+              <w:rPr>
+                <w:b/>
+                <w:bCs/>
+                <w:sz w:val="20"/>
+                <w:szCs w:val="20"/>
+              </w:rPr>
+              <w:t>4</w:t>
             </w:r>
           </w:p>
         </w:tc>
@@ -8766,7 +8949,7 @@
                 <w:sz w:val="20"/>
                 <w:szCs w:val="20"/>
               </w:rPr>
-              <w:t>EP-04</w:t>
+              <w:t>EP-06</w:t>
             </w:r>
           </w:p>
         </w:tc>
@@ -8846,7 +9029,7 @@
                 <w:sz w:val="20"/>
                 <w:szCs w:val="20"/>
               </w:rPr>
-              <w:t>Soporte y operación del piloto</w:t>
+              <w:t>Despliegue para tiendas piloto</w:t>
             </w:r>
           </w:p>
         </w:tc>
@@ -8869,7 +9052,7 @@
                 <w:sz w:val="20"/>
                 <w:szCs w:val="20"/>
               </w:rPr>
-              <w:t>Seguimiento técnico del piloto en 3 tiendas durante al menos dos ciclos semanales de reposición (PIL, CA-03).</w:t>
+              <w:t>Puesta en producción restringida de la plataforma para las 3 tiendas designadas por TuSuper (DPI).</w:t>
             </w:r>
           </w:p>
         </w:tc>
@@ -8883,18 +9066,19 @@
               <w:spacing w:before="120" w:after="120"/>
               <w:rPr>
                 <w:b/>
-                <w:sz w:val="19"/>
-                <w:szCs w:val="19"/>
-              </w:rPr>
-            </w:pPr>
-            <w:r>
-              <w:rPr>
-                <w:b/>
-                <w:bCs/>
-                <w:sz w:val="20"/>
-                <w:szCs w:val="20"/>
-              </w:rPr>
-              <w:t>1.4.3.1</w:t>
+                <w:bCs/>
+                <w:sz w:val="19"/>
+                <w:szCs w:val="19"/>
+              </w:rPr>
+            </w:pPr>
+            <w:r>
+              <w:rPr>
+                <w:b/>
+                <w:bCs/>
+                <w:sz w:val="20"/>
+                <w:szCs w:val="20"/>
+              </w:rPr>
+              <w:t>1.4.2</w:t>
             </w:r>
           </w:p>
         </w:tc>
@@ -8920,7 +9104,7 @@
                 <w:sz w:val="20"/>
                 <w:szCs w:val="20"/>
               </w:rPr>
-              <w:t>EP-05</w:t>
+              <w:t>EP-06</w:t>
             </w:r>
           </w:p>
         </w:tc>
@@ -9000,7 +9184,7 @@
                 <w:sz w:val="20"/>
                 <w:szCs w:val="20"/>
               </w:rPr>
-              <w:t>Despliegue general en toda la cadena</w:t>
+              <w:t>Carga inicial de datos en producción</w:t>
             </w:r>
           </w:p>
         </w:tc>
@@ -9023,7 +9207,7 @@
                 <w:sz w:val="20"/>
                 <w:szCs w:val="20"/>
               </w:rPr>
-              <w:t>Entrada en explotación abriendo la venta en línea a las 32 tiendas antes del 15 de marzo (EXP).</w:t>
+              <w:t>Carga de catálogo real y existencias vivas de las 3 tiendas piloto previo al arranque (CAR).</w:t>
             </w:r>
           </w:p>
         </w:tc>
@@ -9037,18 +9221,19 @@
               <w:spacing w:before="120" w:after="120"/>
               <w:rPr>
                 <w:b/>
-                <w:sz w:val="19"/>
-                <w:szCs w:val="19"/>
-              </w:rPr>
-            </w:pPr>
-            <w:r>
-              <w:rPr>
-                <w:b/>
-                <w:bCs/>
-                <w:sz w:val="20"/>
-                <w:szCs w:val="20"/>
-              </w:rPr>
-              <w:t>1.4.4.1</w:t>
+                <w:bCs/>
+                <w:sz w:val="19"/>
+                <w:szCs w:val="19"/>
+              </w:rPr>
+            </w:pPr>
+            <w:r>
+              <w:rPr>
+                <w:b/>
+                <w:bCs/>
+                <w:sz w:val="20"/>
+                <w:szCs w:val="20"/>
+              </w:rPr>
+              <w:t>1.4.2</w:t>
             </w:r>
           </w:p>
         </w:tc>
@@ -9074,7 +9259,7 @@
                 <w:sz w:val="20"/>
                 <w:szCs w:val="20"/>
               </w:rPr>
-              <w:t>EP-06</w:t>
+              <w:t>EP-04</w:t>
             </w:r>
           </w:p>
         </w:tc>
@@ -9154,7 +9339,7 @@
                 <w:sz w:val="20"/>
                 <w:szCs w:val="20"/>
               </w:rPr>
-              <w:t>Elaboración de manuales y guías</w:t>
+              <w:t>Soporte y operación del piloto</w:t>
             </w:r>
           </w:p>
         </w:tc>
@@ -9177,7 +9362,7 @@
                 <w:sz w:val="20"/>
                 <w:szCs w:val="20"/>
               </w:rPr>
-              <w:t>Redacción del manual de uso del panel de tiendas y de la guía operativa para repartidores (EP-07).</w:t>
+              <w:t>Seguimiento técnico del piloto en 3 tiendas durante al menos dos ciclos semanales de reposición (PIL, CA-03).</w:t>
             </w:r>
           </w:p>
         </w:tc>
@@ -9191,18 +9376,19 @@
               <w:spacing w:before="120" w:after="120"/>
               <w:rPr>
                 <w:b/>
-                <w:sz w:val="19"/>
-                <w:szCs w:val="19"/>
-              </w:rPr>
-            </w:pPr>
-            <w:r>
-              <w:rPr>
-                <w:b/>
-                <w:bCs/>
-                <w:sz w:val="20"/>
-                <w:szCs w:val="20"/>
-              </w:rPr>
-              <w:t>1.5.1.1</w:t>
+                <w:bCs/>
+                <w:sz w:val="19"/>
+                <w:szCs w:val="19"/>
+              </w:rPr>
+            </w:pPr>
+            <w:r>
+              <w:rPr>
+                <w:b/>
+                <w:bCs/>
+                <w:sz w:val="20"/>
+                <w:szCs w:val="20"/>
+              </w:rPr>
+              <w:t>1.4.3</w:t>
             </w:r>
           </w:p>
         </w:tc>
@@ -9228,7 +9414,7 @@
                 <w:sz w:val="20"/>
                 <w:szCs w:val="20"/>
               </w:rPr>
-              <w:t>EP-07</w:t>
+              <w:t>EP-05</w:t>
             </w:r>
           </w:p>
         </w:tc>
@@ -9308,7 +9494,7 @@
                 <w:sz w:val="20"/>
                 <w:szCs w:val="20"/>
               </w:rPr>
-              <w:t>Entrega y acceso al dpto. de formación</w:t>
+              <w:t>Despliegue general en toda la cadena</w:t>
             </w:r>
           </w:p>
         </w:tc>
@@ -9331,7 +9517,7 @@
                 <w:sz w:val="20"/>
                 <w:szCs w:val="20"/>
               </w:rPr>
-              <w:t>Entrega de manuales y habilitación de accesos en preproducción al departamento de formación (DFO).</w:t>
+              <w:t>Entrada en explotación abriendo la venta en línea a las 32 tiendas antes del 15 de marzo (EXP).</w:t>
             </w:r>
           </w:p>
         </w:tc>
@@ -9345,18 +9531,19 @@
               <w:spacing w:before="120" w:after="120"/>
               <w:rPr>
                 <w:b/>
-                <w:sz w:val="19"/>
-                <w:szCs w:val="19"/>
-              </w:rPr>
-            </w:pPr>
-            <w:r>
-              <w:rPr>
-                <w:b/>
-                <w:bCs/>
-                <w:sz w:val="20"/>
-                <w:szCs w:val="20"/>
-              </w:rPr>
-              <w:t>1.5.1.2</w:t>
+                <w:bCs/>
+                <w:sz w:val="19"/>
+                <w:szCs w:val="19"/>
+              </w:rPr>
+            </w:pPr>
+            <w:r>
+              <w:rPr>
+                <w:b/>
+                <w:bCs/>
+                <w:sz w:val="20"/>
+                <w:szCs w:val="20"/>
+              </w:rPr>
+              <w:t>1.4.4</w:t>
             </w:r>
           </w:p>
         </w:tc>
@@ -9382,7 +9569,7 @@
                 <w:sz w:val="20"/>
                 <w:szCs w:val="20"/>
               </w:rPr>
-              <w:t>EP-07</w:t>
+              <w:t>EP-06</w:t>
             </w:r>
           </w:p>
         </w:tc>
@@ -9439,7 +9626,6 @@
                 <w:sz w:val="20"/>
                 <w:szCs w:val="20"/>
               </w:rPr>
-              <w:lastRenderedPageBreak/>
               <w:t>ACT-52</w:t>
             </w:r>
           </w:p>
@@ -9463,7 +9649,7 @@
                 <w:sz w:val="20"/>
                 <w:szCs w:val="20"/>
               </w:rPr>
-              <w:t>Pedido y contratación del conector</w:t>
+              <w:t>Elaboración de manuales y guías</w:t>
             </w:r>
           </w:p>
         </w:tc>
@@ -9486,23 +9672,7 @@
                 <w:sz w:val="20"/>
                 <w:szCs w:val="20"/>
               </w:rPr>
-              <w:t xml:space="preserve">Formalización del pedido de compra del conector homologado a </w:t>
-            </w:r>
-            <w:proofErr w:type="spellStart"/>
-            <w:r>
-              <w:rPr>
-                <w:sz w:val="20"/>
-                <w:szCs w:val="20"/>
-              </w:rPr>
-              <w:t>Conectia</w:t>
-            </w:r>
-            <w:proofErr w:type="spellEnd"/>
-            <w:r>
-              <w:rPr>
-                <w:sz w:val="20"/>
-                <w:szCs w:val="20"/>
-              </w:rPr>
-              <w:t xml:space="preserve"> Integración de Sistemas (PED).</w:t>
+              <w:t>Redacción del manual de uso del panel de tiendas y de la guía operativa para repartidores (EP-07).</w:t>
             </w:r>
           </w:p>
         </w:tc>
@@ -9516,18 +9686,19 @@
               <w:spacing w:before="120" w:after="120"/>
               <w:rPr>
                 <w:b/>
-                <w:sz w:val="19"/>
-                <w:szCs w:val="19"/>
-              </w:rPr>
-            </w:pPr>
-            <w:r>
-              <w:rPr>
-                <w:b/>
-                <w:bCs/>
-                <w:sz w:val="20"/>
-                <w:szCs w:val="20"/>
-              </w:rPr>
-              <w:t>1.6.1.1</w:t>
+                <w:bCs/>
+                <w:sz w:val="19"/>
+                <w:szCs w:val="19"/>
+              </w:rPr>
+            </w:pPr>
+            <w:r>
+              <w:rPr>
+                <w:b/>
+                <w:bCs/>
+                <w:sz w:val="20"/>
+                <w:szCs w:val="20"/>
+              </w:rPr>
+              <w:t>1.5.1</w:t>
             </w:r>
           </w:p>
         </w:tc>
@@ -9547,10 +9718,13 @@
             </w:pPr>
             <w:r>
               <w:rPr>
-                <w:sz w:val="20"/>
-                <w:szCs w:val="20"/>
-              </w:rPr>
-              <w:t>—</w:t>
+                <w:b/>
+                <w:bCs/>
+                <w:color w:val="548235"/>
+                <w:sz w:val="20"/>
+                <w:szCs w:val="20"/>
+              </w:rPr>
+              <w:t>EP-07</w:t>
             </w:r>
           </w:p>
         </w:tc>
@@ -9630,7 +9804,7 @@
                 <w:sz w:val="20"/>
                 <w:szCs w:val="20"/>
               </w:rPr>
-              <w:t>Seguimiento del proveedor del conector</w:t>
+              <w:t>Entrega y acceso al dpto. de formación</w:t>
             </w:r>
           </w:p>
         </w:tc>
@@ -9653,7 +9827,7 @@
                 <w:sz w:val="20"/>
                 <w:szCs w:val="20"/>
               </w:rPr>
-              <w:t>Monitorización de hitos, entregas intermedias y plazos del proveedor del conector (SEG).</w:t>
+              <w:t>Entrega de manuales y habilitación de accesos en preproducción al departamento de formación (DFO).</w:t>
             </w:r>
           </w:p>
         </w:tc>
@@ -9667,18 +9841,28 @@
               <w:spacing w:before="120" w:after="120"/>
               <w:rPr>
                 <w:b/>
-                <w:sz w:val="19"/>
-                <w:szCs w:val="19"/>
-              </w:rPr>
-            </w:pPr>
-            <w:r>
-              <w:rPr>
-                <w:b/>
-                <w:bCs/>
-                <w:sz w:val="20"/>
-                <w:szCs w:val="20"/>
-              </w:rPr>
-              <w:t>1.6.1.2</w:t>
+                <w:bCs/>
+                <w:sz w:val="19"/>
+                <w:szCs w:val="19"/>
+              </w:rPr>
+            </w:pPr>
+            <w:r>
+              <w:rPr>
+                <w:b/>
+                <w:bCs/>
+                <w:sz w:val="20"/>
+                <w:szCs w:val="20"/>
+              </w:rPr>
+              <w:t>1.5.</w:t>
+            </w:r>
+            <w:r>
+              <w:rPr>
+                <w:b/>
+                <w:bCs/>
+                <w:sz w:val="20"/>
+                <w:szCs w:val="20"/>
+              </w:rPr>
+              <w:t>2</w:t>
             </w:r>
           </w:p>
         </w:tc>
@@ -9698,10 +9882,13 @@
             </w:pPr>
             <w:r>
               <w:rPr>
-                <w:sz w:val="20"/>
-                <w:szCs w:val="20"/>
-              </w:rPr>
-              <w:t>—</w:t>
+                <w:b/>
+                <w:bCs/>
+                <w:color w:val="548235"/>
+                <w:sz w:val="20"/>
+                <w:szCs w:val="20"/>
+              </w:rPr>
+              <w:t>EP-07</w:t>
             </w:r>
           </w:p>
         </w:tc>
@@ -9781,7 +9968,7 @@
                 <w:sz w:val="20"/>
                 <w:szCs w:val="20"/>
               </w:rPr>
-              <w:t>Aceptación formal del conector</w:t>
+              <w:t>Pedido y contratación del conector</w:t>
             </w:r>
           </w:p>
         </w:tc>
@@ -9804,7 +9991,7 @@
                 <w:sz w:val="20"/>
                 <w:szCs w:val="20"/>
               </w:rPr>
-              <w:t>Pruebas de conformidad y firma del acta de recepción técnica del conector (ACO).</w:t>
+              <w:t>Formalización del pedido de compra del conector homologado a Conectia Integración de Sistemas (PED).</w:t>
             </w:r>
           </w:p>
         </w:tc>
@@ -9818,18 +10005,19 @@
               <w:spacing w:before="120" w:after="120"/>
               <w:rPr>
                 <w:b/>
-                <w:sz w:val="19"/>
-                <w:szCs w:val="19"/>
-              </w:rPr>
-            </w:pPr>
-            <w:r>
-              <w:rPr>
-                <w:b/>
-                <w:bCs/>
-                <w:sz w:val="20"/>
-                <w:szCs w:val="20"/>
-              </w:rPr>
-              <w:t>1.6.1.3</w:t>
+                <w:bCs/>
+                <w:sz w:val="19"/>
+                <w:szCs w:val="19"/>
+              </w:rPr>
+            </w:pPr>
+            <w:r>
+              <w:rPr>
+                <w:b/>
+                <w:bCs/>
+                <w:sz w:val="20"/>
+                <w:szCs w:val="20"/>
+              </w:rPr>
+              <w:t>1.6.1.1</w:t>
             </w:r>
           </w:p>
         </w:tc>
@@ -9932,7 +10120,7 @@
                 <w:sz w:val="20"/>
                 <w:szCs w:val="20"/>
               </w:rPr>
-              <w:t>Formalización del encargo de formación</w:t>
+              <w:t>Seguimiento del proveedor del conector</w:t>
             </w:r>
           </w:p>
         </w:tc>
@@ -9955,7 +10143,7 @@
                 <w:sz w:val="20"/>
                 <w:szCs w:val="20"/>
               </w:rPr>
-              <w:t>Emisión del encargo de formación a usuarios al departamento interno de Taracea (EFO, NOR-26).</w:t>
+              <w:t>Monitorización de hitos, entregas intermedias y plazos del proveedor del conector (SEG).</w:t>
             </w:r>
           </w:p>
         </w:tc>
@@ -9969,18 +10157,19 @@
               <w:spacing w:before="120" w:after="120"/>
               <w:rPr>
                 <w:b/>
-                <w:sz w:val="19"/>
-                <w:szCs w:val="19"/>
-              </w:rPr>
-            </w:pPr>
-            <w:r>
-              <w:rPr>
-                <w:b/>
-                <w:bCs/>
-                <w:sz w:val="20"/>
-                <w:szCs w:val="20"/>
-              </w:rPr>
-              <w:t>1.6.2.1</w:t>
+                <w:bCs/>
+                <w:sz w:val="19"/>
+                <w:szCs w:val="19"/>
+              </w:rPr>
+            </w:pPr>
+            <w:r>
+              <w:rPr>
+                <w:b/>
+                <w:bCs/>
+                <w:sz w:val="20"/>
+                <w:szCs w:val="20"/>
+              </w:rPr>
+              <w:t>1.6.1.2</w:t>
             </w:r>
           </w:p>
         </w:tc>
@@ -10083,7 +10272,7 @@
                 <w:sz w:val="20"/>
                 <w:szCs w:val="20"/>
               </w:rPr>
-              <w:t>Formación de personal de tiendas piloto</w:t>
+              <w:t>Aceptación formal del conector</w:t>
             </w:r>
           </w:p>
         </w:tc>
@@ -10106,7 +10295,7 @@
                 <w:sz w:val="20"/>
                 <w:szCs w:val="20"/>
               </w:rPr>
-              <w:t>Impartición de las sesiones formativas al personal de las 3 tiendas piloto en el uso de la plataforma (FPI).</w:t>
+              <w:t>Pruebas de conformidad y firma del acta de recepción técnica del conector (ACO).</w:t>
             </w:r>
           </w:p>
         </w:tc>
@@ -10120,18 +10309,19 @@
               <w:spacing w:before="120" w:after="120"/>
               <w:rPr>
                 <w:b/>
-                <w:sz w:val="19"/>
-                <w:szCs w:val="19"/>
-              </w:rPr>
-            </w:pPr>
-            <w:r>
-              <w:rPr>
-                <w:b/>
-                <w:bCs/>
-                <w:sz w:val="20"/>
-                <w:szCs w:val="20"/>
-              </w:rPr>
-              <w:t>1.6.2.2</w:t>
+                <w:bCs/>
+                <w:sz w:val="19"/>
+                <w:szCs w:val="19"/>
+              </w:rPr>
+            </w:pPr>
+            <w:r>
+              <w:rPr>
+                <w:b/>
+                <w:bCs/>
+                <w:sz w:val="20"/>
+                <w:szCs w:val="20"/>
+              </w:rPr>
+              <w:t>1.6.1.3</w:t>
             </w:r>
           </w:p>
         </w:tc>
@@ -10202,81 +10392,136 @@
                 <w:szCs w:val="19"/>
               </w:rPr>
             </w:pPr>
+            <w:r>
+              <w:rPr>
+                <w:b/>
+                <w:bCs/>
+                <w:color w:val="1F497D"/>
+                <w:sz w:val="20"/>
+                <w:szCs w:val="20"/>
+              </w:rPr>
+              <w:t>ACT-57</w:t>
+            </w:r>
           </w:p>
         </w:tc>
         <w:tc>
           <w:tcPr>
             <w:tcW w:w="3070" w:type="dxa"/>
-          </w:tcPr>
-          <w:p>
-            <w:pPr>
-              <w:spacing w:before="120" w:after="120"/>
-              <w:rPr>
-                <w:b/>
-                <w:sz w:val="19"/>
-                <w:szCs w:val="19"/>
-              </w:rPr>
-            </w:pPr>
+            <w:vAlign w:val="center"/>
+          </w:tcPr>
+          <w:p>
+            <w:pPr>
+              <w:spacing w:before="120" w:after="120"/>
+              <w:rPr>
+                <w:b/>
+                <w:sz w:val="19"/>
+                <w:szCs w:val="19"/>
+              </w:rPr>
+            </w:pPr>
+            <w:r>
+              <w:rPr>
+                <w:sz w:val="20"/>
+                <w:szCs w:val="20"/>
+              </w:rPr>
+              <w:t>Formalización del encargo de formación</w:t>
+            </w:r>
           </w:p>
         </w:tc>
         <w:tc>
           <w:tcPr>
             <w:tcW w:w="7235" w:type="dxa"/>
-          </w:tcPr>
-          <w:p>
-            <w:pPr>
-              <w:spacing w:before="120" w:after="120"/>
-              <w:rPr>
-                <w:b/>
-                <w:sz w:val="19"/>
-                <w:szCs w:val="19"/>
-              </w:rPr>
-            </w:pPr>
+            <w:vAlign w:val="center"/>
+          </w:tcPr>
+          <w:p>
+            <w:pPr>
+              <w:spacing w:before="120" w:after="120"/>
+              <w:rPr>
+                <w:b/>
+                <w:sz w:val="19"/>
+                <w:szCs w:val="19"/>
+              </w:rPr>
+            </w:pPr>
+            <w:r>
+              <w:rPr>
+                <w:sz w:val="20"/>
+                <w:szCs w:val="20"/>
+              </w:rPr>
+              <w:t>Emisión del encargo de formación a usuarios al departamento interno de Taracea (EFO, NOR-26).</w:t>
+            </w:r>
           </w:p>
         </w:tc>
         <w:tc>
           <w:tcPr>
             <w:tcW w:w="1478" w:type="dxa"/>
-          </w:tcPr>
-          <w:p>
-            <w:pPr>
-              <w:spacing w:before="120" w:after="120"/>
-              <w:rPr>
-                <w:b/>
-                <w:sz w:val="19"/>
-                <w:szCs w:val="19"/>
-              </w:rPr>
-            </w:pPr>
+            <w:vAlign w:val="center"/>
+          </w:tcPr>
+          <w:p>
+            <w:pPr>
+              <w:spacing w:before="120" w:after="120"/>
+              <w:rPr>
+                <w:b/>
+                <w:bCs/>
+                <w:sz w:val="19"/>
+                <w:szCs w:val="19"/>
+              </w:rPr>
+            </w:pPr>
+            <w:r>
+              <w:rPr>
+                <w:b/>
+                <w:bCs/>
+                <w:sz w:val="20"/>
+                <w:szCs w:val="20"/>
+              </w:rPr>
+              <w:t>1.6.2.1</w:t>
+            </w:r>
           </w:p>
         </w:tc>
         <w:tc>
           <w:tcPr>
             <w:tcW w:w="1155" w:type="dxa"/>
-          </w:tcPr>
-          <w:p>
-            <w:pPr>
-              <w:spacing w:before="120" w:after="120"/>
-              <w:rPr>
-                <w:b/>
-                <w:sz w:val="19"/>
-                <w:szCs w:val="19"/>
-              </w:rPr>
-            </w:pPr>
+            <w:vAlign w:val="center"/>
+          </w:tcPr>
+          <w:p>
+            <w:pPr>
+              <w:spacing w:before="120" w:after="120"/>
+              <w:rPr>
+                <w:b/>
+                <w:sz w:val="19"/>
+                <w:szCs w:val="19"/>
+              </w:rPr>
+            </w:pPr>
+            <w:r>
+              <w:rPr>
+                <w:sz w:val="20"/>
+                <w:szCs w:val="20"/>
+              </w:rPr>
+              <w:t>—</w:t>
+            </w:r>
           </w:p>
         </w:tc>
         <w:tc>
           <w:tcPr>
             <w:tcW w:w="923" w:type="dxa"/>
-          </w:tcPr>
-          <w:p>
-            <w:pPr>
-              <w:spacing w:before="120" w:after="120"/>
-              <w:rPr>
-                <w:b/>
-                <w:sz w:val="19"/>
-                <w:szCs w:val="19"/>
-              </w:rPr>
-            </w:pPr>
+            <w:vAlign w:val="center"/>
+          </w:tcPr>
+          <w:p>
+            <w:pPr>
+              <w:spacing w:before="120" w:after="120"/>
+              <w:rPr>
+                <w:b/>
+                <w:sz w:val="19"/>
+                <w:szCs w:val="19"/>
+              </w:rPr>
+            </w:pPr>
+            <w:r>
+              <w:rPr>
+                <w:b/>
+                <w:bCs/>
+                <w:sz w:val="20"/>
+                <w:szCs w:val="20"/>
+              </w:rPr>
+              <w:t>—</w:t>
+            </w:r>
           </w:p>
         </w:tc>
       </w:tr>
@@ -10298,81 +10543,463 @@
                 <w:szCs w:val="19"/>
               </w:rPr>
             </w:pPr>
+            <w:r>
+              <w:rPr>
+                <w:b/>
+                <w:bCs/>
+                <w:color w:val="1F497D"/>
+                <w:sz w:val="20"/>
+                <w:szCs w:val="20"/>
+              </w:rPr>
+              <w:t>ACT-58</w:t>
+            </w:r>
           </w:p>
         </w:tc>
         <w:tc>
           <w:tcPr>
             <w:tcW w:w="3070" w:type="dxa"/>
-          </w:tcPr>
-          <w:p>
-            <w:pPr>
-              <w:spacing w:before="120" w:after="120"/>
-              <w:rPr>
-                <w:b/>
-                <w:sz w:val="19"/>
-                <w:szCs w:val="19"/>
-              </w:rPr>
-            </w:pPr>
+            <w:vAlign w:val="center"/>
+          </w:tcPr>
+          <w:p>
+            <w:pPr>
+              <w:spacing w:before="120" w:after="120"/>
+              <w:rPr>
+                <w:b/>
+                <w:sz w:val="19"/>
+                <w:szCs w:val="19"/>
+              </w:rPr>
+            </w:pPr>
+            <w:r>
+              <w:rPr>
+                <w:sz w:val="20"/>
+                <w:szCs w:val="20"/>
+              </w:rPr>
+              <w:t>Formación de personal de tiendas piloto</w:t>
+            </w:r>
           </w:p>
         </w:tc>
         <w:tc>
           <w:tcPr>
             <w:tcW w:w="7235" w:type="dxa"/>
-          </w:tcPr>
-          <w:p>
-            <w:pPr>
-              <w:spacing w:before="120" w:after="120"/>
-              <w:rPr>
-                <w:b/>
-                <w:sz w:val="19"/>
-                <w:szCs w:val="19"/>
-              </w:rPr>
-            </w:pPr>
+            <w:vAlign w:val="center"/>
+          </w:tcPr>
+          <w:p>
+            <w:pPr>
+              <w:spacing w:before="120" w:after="120"/>
+              <w:rPr>
+                <w:b/>
+                <w:sz w:val="19"/>
+                <w:szCs w:val="19"/>
+              </w:rPr>
+            </w:pPr>
+            <w:r>
+              <w:rPr>
+                <w:sz w:val="20"/>
+                <w:szCs w:val="20"/>
+              </w:rPr>
+              <w:t>Impartición de las sesiones formativas al personal de las 3 tiendas piloto en el uso de la plataforma (FPI).</w:t>
+            </w:r>
           </w:p>
         </w:tc>
         <w:tc>
           <w:tcPr>
             <w:tcW w:w="1478" w:type="dxa"/>
-          </w:tcPr>
-          <w:p>
-            <w:pPr>
-              <w:spacing w:before="120" w:after="120"/>
-              <w:rPr>
-                <w:b/>
-                <w:sz w:val="19"/>
-                <w:szCs w:val="19"/>
-              </w:rPr>
-            </w:pPr>
+            <w:vAlign w:val="center"/>
+          </w:tcPr>
+          <w:p>
+            <w:pPr>
+              <w:spacing w:before="120" w:after="120"/>
+              <w:rPr>
+                <w:b/>
+                <w:bCs/>
+                <w:sz w:val="19"/>
+                <w:szCs w:val="19"/>
+              </w:rPr>
+            </w:pPr>
+            <w:r>
+              <w:rPr>
+                <w:b/>
+                <w:bCs/>
+                <w:sz w:val="20"/>
+                <w:szCs w:val="20"/>
+              </w:rPr>
+              <w:t>1.6.2.</w:t>
+            </w:r>
+            <w:r>
+              <w:rPr>
+                <w:b/>
+                <w:bCs/>
+                <w:sz w:val="20"/>
+                <w:szCs w:val="20"/>
+              </w:rPr>
+              <w:t>3</w:t>
+            </w:r>
           </w:p>
         </w:tc>
         <w:tc>
           <w:tcPr>
             <w:tcW w:w="1155" w:type="dxa"/>
-          </w:tcPr>
-          <w:p>
-            <w:pPr>
-              <w:spacing w:before="120" w:after="120"/>
-              <w:rPr>
-                <w:b/>
-                <w:sz w:val="19"/>
-                <w:szCs w:val="19"/>
-              </w:rPr>
-            </w:pPr>
+            <w:vAlign w:val="center"/>
+          </w:tcPr>
+          <w:p>
+            <w:pPr>
+              <w:spacing w:before="120" w:after="120"/>
+              <w:rPr>
+                <w:b/>
+                <w:sz w:val="19"/>
+                <w:szCs w:val="19"/>
+              </w:rPr>
+            </w:pPr>
+            <w:r>
+              <w:rPr>
+                <w:sz w:val="20"/>
+                <w:szCs w:val="20"/>
+              </w:rPr>
+              <w:t>—</w:t>
+            </w:r>
           </w:p>
         </w:tc>
         <w:tc>
           <w:tcPr>
             <w:tcW w:w="923" w:type="dxa"/>
-          </w:tcPr>
-          <w:p>
-            <w:pPr>
-              <w:spacing w:before="120" w:after="120"/>
-              <w:rPr>
-                <w:b/>
-                <w:sz w:val="19"/>
-                <w:szCs w:val="19"/>
-              </w:rPr>
-            </w:pPr>
+            <w:vAlign w:val="center"/>
+          </w:tcPr>
+          <w:p>
+            <w:pPr>
+              <w:spacing w:before="120" w:after="120"/>
+              <w:rPr>
+                <w:b/>
+                <w:sz w:val="19"/>
+                <w:szCs w:val="19"/>
+              </w:rPr>
+            </w:pPr>
+            <w:r>
+              <w:rPr>
+                <w:b/>
+                <w:bCs/>
+                <w:sz w:val="20"/>
+                <w:szCs w:val="20"/>
+              </w:rPr>
+              <w:t>—</w:t>
+            </w:r>
+          </w:p>
+        </w:tc>
+      </w:tr>
+      <w:tr>
+        <w:trPr>
+          <w:cantSplit/>
+        </w:trPr>
+        <w:tc>
+          <w:tcPr>
+            <w:tcW w:w="709" w:type="dxa"/>
+          </w:tcPr>
+          <w:p>
+            <w:pPr>
+              <w:spacing w:before="120" w:after="120"/>
+              <w:jc w:val="center"/>
+              <w:rPr>
+                <w:b/>
+                <w:sz w:val="19"/>
+                <w:szCs w:val="19"/>
+              </w:rPr>
+            </w:pPr>
+            <w:r>
+              <w:rPr>
+                <w:b/>
+                <w:bCs/>
+                <w:color w:val="1F497D"/>
+                <w:sz w:val="20"/>
+                <w:szCs w:val="20"/>
+              </w:rPr>
+              <w:t>ACT-</w:t>
+            </w:r>
+            <w:r>
+              <w:rPr>
+                <w:b/>
+                <w:bCs/>
+                <w:color w:val="1F497D"/>
+                <w:sz w:val="20"/>
+                <w:szCs w:val="20"/>
+              </w:rPr>
+              <w:t>59</w:t>
+            </w:r>
+          </w:p>
+        </w:tc>
+        <w:tc>
+          <w:tcPr>
+            <w:tcW w:w="3070" w:type="dxa"/>
+          </w:tcPr>
+          <w:p>
+            <w:pPr>
+              <w:spacing w:before="120" w:after="120"/>
+              <w:rPr>
+                <w:b/>
+                <w:sz w:val="19"/>
+                <w:szCs w:val="19"/>
+              </w:rPr>
+            </w:pPr>
+            <w:r>
+              <w:rPr>
+                <w:sz w:val="20"/>
+                <w:szCs w:val="20"/>
+              </w:rPr>
+              <w:t>Seguimiento de documentación y formación</w:t>
+            </w:r>
+          </w:p>
+        </w:tc>
+        <w:tc>
+          <w:tcPr>
+            <w:tcW w:w="7235" w:type="dxa"/>
+          </w:tcPr>
+          <w:p>
+            <w:pPr>
+              <w:spacing w:before="120" w:after="120"/>
+              <w:rPr>
+                <w:bCs/>
+                <w:sz w:val="20"/>
+                <w:szCs w:val="20"/>
+              </w:rPr>
+            </w:pPr>
+            <w:r>
+              <w:rPr>
+                <w:bCs/>
+                <w:sz w:val="20"/>
+                <w:szCs w:val="20"/>
+              </w:rPr>
+              <w:t>Seguimiento de la elaboración y entrega de la documentación técnica y funcional, así como de la preparación y coordinación de las actividades formativas por parte del departamento de formación.</w:t>
+            </w:r>
+          </w:p>
+        </w:tc>
+        <w:tc>
+          <w:tcPr>
+            <w:tcW w:w="1478" w:type="dxa"/>
+          </w:tcPr>
+          <w:p>
+            <w:pPr>
+              <w:spacing w:before="120" w:after="120"/>
+              <w:rPr>
+                <w:b/>
+                <w:bCs/>
+                <w:sz w:val="19"/>
+                <w:szCs w:val="19"/>
+              </w:rPr>
+            </w:pPr>
+            <w:r>
+              <w:rPr>
+                <w:b/>
+                <w:bCs/>
+                <w:sz w:val="19"/>
+                <w:szCs w:val="19"/>
+              </w:rPr>
+              <w:t>1.6.2.3</w:t>
+            </w:r>
+          </w:p>
+        </w:tc>
+        <w:tc>
+          <w:tcPr>
+            <w:tcW w:w="1155" w:type="dxa"/>
+            <w:vAlign w:val="center"/>
+          </w:tcPr>
+          <w:p>
+            <w:pPr>
+              <w:spacing w:before="120" w:after="120"/>
+              <w:rPr>
+                <w:b/>
+                <w:sz w:val="19"/>
+                <w:szCs w:val="19"/>
+              </w:rPr>
+            </w:pPr>
+            <w:r>
+              <w:rPr>
+                <w:sz w:val="20"/>
+                <w:szCs w:val="20"/>
+              </w:rPr>
+              <w:t>—</w:t>
+            </w:r>
+          </w:p>
+        </w:tc>
+        <w:tc>
+          <w:tcPr>
+            <w:tcW w:w="923" w:type="dxa"/>
+            <w:vAlign w:val="center"/>
+          </w:tcPr>
+          <w:p>
+            <w:pPr>
+              <w:spacing w:before="120" w:after="120"/>
+              <w:rPr>
+                <w:b/>
+                <w:sz w:val="19"/>
+                <w:szCs w:val="19"/>
+              </w:rPr>
+            </w:pPr>
+            <w:r>
+              <w:rPr>
+                <w:b/>
+                <w:bCs/>
+                <w:sz w:val="20"/>
+                <w:szCs w:val="20"/>
+              </w:rPr>
+              <w:t>—</w:t>
+            </w:r>
+          </w:p>
+        </w:tc>
+      </w:tr>
+      <w:tr>
+        <w:trPr>
+          <w:cantSplit/>
+        </w:trPr>
+        <w:tc>
+          <w:tcPr>
+            <w:tcW w:w="709" w:type="dxa"/>
+          </w:tcPr>
+          <w:p>
+            <w:pPr>
+              <w:spacing w:before="120" w:after="120"/>
+              <w:jc w:val="center"/>
+              <w:rPr>
+                <w:b/>
+                <w:sz w:val="19"/>
+                <w:szCs w:val="19"/>
+              </w:rPr>
+            </w:pPr>
+            <w:r>
+              <w:rPr>
+                <w:b/>
+                <w:bCs/>
+                <w:color w:val="1F497D"/>
+                <w:sz w:val="20"/>
+                <w:szCs w:val="20"/>
+              </w:rPr>
+              <w:t>ACT-</w:t>
+            </w:r>
+            <w:r>
+              <w:rPr>
+                <w:b/>
+                <w:bCs/>
+                <w:color w:val="1F497D"/>
+                <w:sz w:val="20"/>
+                <w:szCs w:val="20"/>
+              </w:rPr>
+              <w:t>60</w:t>
+            </w:r>
+          </w:p>
+        </w:tc>
+        <w:tc>
+          <w:tcPr>
+            <w:tcW w:w="3070" w:type="dxa"/>
+          </w:tcPr>
+          <w:p>
+            <w:pPr>
+              <w:spacing w:before="120" w:after="120"/>
+              <w:rPr>
+                <w:b/>
+                <w:sz w:val="19"/>
+                <w:szCs w:val="19"/>
+              </w:rPr>
+            </w:pPr>
+            <w:r>
+              <w:rPr>
+                <w:sz w:val="20"/>
+                <w:szCs w:val="20"/>
+              </w:rPr>
+              <w:t>Aceptación del manual, la guía y la formación</w:t>
+            </w:r>
+          </w:p>
+        </w:tc>
+        <w:tc>
+          <w:tcPr>
+            <w:tcW w:w="7235" w:type="dxa"/>
+          </w:tcPr>
+          <w:p>
+            <w:pPr>
+              <w:spacing w:before="120" w:after="120"/>
+              <w:rPr>
+                <w:bCs/>
+                <w:sz w:val="20"/>
+                <w:szCs w:val="20"/>
+              </w:rPr>
+            </w:pPr>
+            <w:r>
+              <w:rPr>
+                <w:bCs/>
+                <w:sz w:val="20"/>
+                <w:szCs w:val="20"/>
+              </w:rPr>
+              <w:t>Revisión y aceptación formal del manual de usuario, las guías de uso y las actividades de formación, verificando que los entregables cumplen los requisitos establecidos.</w:t>
+            </w:r>
+          </w:p>
+        </w:tc>
+        <w:tc>
+          <w:tcPr>
+            <w:tcW w:w="1478" w:type="dxa"/>
+          </w:tcPr>
+          <w:p>
+            <w:pPr>
+              <w:spacing w:before="120" w:after="120"/>
+              <w:rPr>
+                <w:b/>
+                <w:bCs/>
+                <w:sz w:val="19"/>
+                <w:szCs w:val="19"/>
+              </w:rPr>
+            </w:pPr>
+            <w:r>
+              <w:rPr>
+                <w:b/>
+                <w:bCs/>
+                <w:sz w:val="19"/>
+                <w:szCs w:val="19"/>
+              </w:rPr>
+              <w:t>1.6.2.3</w:t>
+            </w:r>
+          </w:p>
+        </w:tc>
+        <w:tc>
+          <w:tcPr>
+            <w:tcW w:w="1155" w:type="dxa"/>
+            <w:vAlign w:val="center"/>
+          </w:tcPr>
+          <w:p>
+            <w:pPr>
+              <w:spacing w:before="120" w:after="120"/>
+              <w:rPr>
+                <w:b/>
+                <w:sz w:val="19"/>
+                <w:szCs w:val="19"/>
+              </w:rPr>
+            </w:pPr>
+            <w:r>
+              <w:rPr>
+                <w:sz w:val="20"/>
+                <w:szCs w:val="20"/>
+              </w:rPr>
+              <w:t>—</w:t>
+            </w:r>
+          </w:p>
+        </w:tc>
+        <w:tc>
+          <w:tcPr>
+            <w:tcW w:w="923" w:type="dxa"/>
+            <w:vAlign w:val="center"/>
+          </w:tcPr>
+          <w:p>
+            <w:pPr>
+              <w:spacing w:before="120" w:after="120"/>
+              <w:rPr>
+                <w:b/>
+                <w:sz w:val="19"/>
+                <w:szCs w:val="19"/>
+              </w:rPr>
+            </w:pPr>
+            <w:r>
+              <w:rPr>
+                <w:b/>
+                <w:bCs/>
+                <w:sz w:val="20"/>
+                <w:szCs w:val="20"/>
+              </w:rPr>
+              <w:t>—</w:t>
+            </w:r>
           </w:p>
         </w:tc>
       </w:tr>
@@ -11274,13 +11901,12 @@
       <w:color w:val="1A1A1A"/>
     </w:rPr>
   </w:style>
-  <w:style w:type="character" w:default="1" w:styleId="DefaultParagraphFont">
+  <w:style w:type="character" w:default="1" w:styleId="Fuentedeprrafopredeter">
     <w:name w:val="Default Paragraph Font"/>
     <w:uiPriority w:val="1"/>
-    <w:semiHidden/>
     <w:unhideWhenUsed/>
   </w:style>
-  <w:style w:type="table" w:default="1" w:styleId="TableNormal">
+  <w:style w:type="table" w:default="1" w:styleId="Tablanormal">
     <w:name w:val="Normal Table"/>
     <w:uiPriority w:val="99"/>
     <w:semiHidden/>
@@ -11295,16 +11921,16 @@
       </w:tblCellMar>
     </w:tblPr>
   </w:style>
-  <w:style w:type="numbering" w:default="1" w:styleId="NoList">
+  <w:style w:type="numbering" w:default="1" w:styleId="Sinlista">
     <w:name w:val="No List"/>
     <w:uiPriority w:val="99"/>
     <w:semiHidden/>
     <w:unhideWhenUsed/>
   </w:style>
-  <w:style w:type="paragraph" w:styleId="Header">
+  <w:style w:type="paragraph" w:styleId="Encabezado">
     <w:name w:val="header"/>
     <w:basedOn w:val="Normal"/>
-    <w:link w:val="HeaderChar"/>
+    <w:link w:val="EncabezadoCar"/>
     <w:uiPriority w:val="99"/>
     <w:unhideWhenUsed/>
     <w:rsid w:val="00837F2F"/>
@@ -11316,17 +11942,17 @@
       <w:spacing w:after="0" w:afterAutospacing="1" w:line="240" w:lineRule="auto"/>
     </w:pPr>
   </w:style>
-  <w:style w:type="character" w:customStyle="1" w:styleId="HeaderChar">
-    <w:name w:val="Header Char"/>
-    <w:basedOn w:val="DefaultParagraphFont"/>
-    <w:link w:val="Header"/>
+  <w:style w:type="character" w:customStyle="1" w:styleId="EncabezadoCar">
+    <w:name w:val="Encabezado Car"/>
+    <w:basedOn w:val="Fuentedeprrafopredeter"/>
+    <w:link w:val="Encabezado"/>
     <w:uiPriority w:val="99"/>
     <w:rsid w:val="00837F2F"/>
   </w:style>
-  <w:style w:type="paragraph" w:styleId="Footer">
+  <w:style w:type="paragraph" w:styleId="Piedepgina">
     <w:name w:val="footer"/>
     <w:basedOn w:val="Normal"/>
-    <w:link w:val="FooterChar"/>
+    <w:link w:val="PiedepginaCar"/>
     <w:uiPriority w:val="99"/>
     <w:unhideWhenUsed/>
     <w:rsid w:val="00837F2F"/>
@@ -11338,17 +11964,17 @@
       <w:spacing w:after="0" w:afterAutospacing="1" w:line="240" w:lineRule="auto"/>
     </w:pPr>
   </w:style>
-  <w:style w:type="character" w:customStyle="1" w:styleId="FooterChar">
-    <w:name w:val="Footer Char"/>
-    <w:basedOn w:val="DefaultParagraphFont"/>
-    <w:link w:val="Footer"/>
+  <w:style w:type="character" w:customStyle="1" w:styleId="PiedepginaCar">
+    <w:name w:val="Pie de página Car"/>
+    <w:basedOn w:val="Fuentedeprrafopredeter"/>
+    <w:link w:val="Piedepgina"/>
     <w:uiPriority w:val="99"/>
     <w:rsid w:val="00837F2F"/>
   </w:style>
-  <w:style w:type="paragraph" w:styleId="BalloonText">
+  <w:style w:type="paragraph" w:styleId="Textodeglobo">
     <w:name w:val="Balloon Text"/>
     <w:basedOn w:val="Normal"/>
-    <w:link w:val="BalloonTextChar"/>
+    <w:link w:val="TextodegloboCar"/>
     <w:uiPriority w:val="99"/>
     <w:semiHidden/>
     <w:unhideWhenUsed/>
@@ -11361,10 +11987,10 @@
       <w:szCs w:val="16"/>
     </w:rPr>
   </w:style>
-  <w:style w:type="character" w:customStyle="1" w:styleId="BalloonTextChar">
-    <w:name w:val="Balloon Text Char"/>
-    <w:basedOn w:val="DefaultParagraphFont"/>
-    <w:link w:val="BalloonText"/>
+  <w:style w:type="character" w:customStyle="1" w:styleId="TextodegloboCar">
+    <w:name w:val="Texto de globo Car"/>
+    <w:basedOn w:val="Fuentedeprrafopredeter"/>
+    <w:link w:val="Textodeglobo"/>
     <w:uiPriority w:val="99"/>
     <w:semiHidden/>
     <w:rsid w:val="00837F2F"/>
@@ -11374,9 +12000,9 @@
       <w:szCs w:val="16"/>
     </w:rPr>
   </w:style>
-  <w:style w:type="table" w:styleId="TableGrid">
+  <w:style w:type="table" w:styleId="Tablaconcuadrcula">
     <w:name w:val="Table Grid"/>
-    <w:basedOn w:val="TableNormal"/>
+    <w:basedOn w:val="Tablanormal"/>
     <w:uiPriority w:val="59"/>
     <w:rsid w:val="000512B0"/>
     <w:pPr>

</xml_diff>